<commit_message>
update: AlgebraLinear correção do documento
</commit_message>
<xml_diff>
--- a/documentos/Entrega2/AlgebraLinear/AlgebraLinear - Relatório 2.docx
+++ b/documentos/Entrega2/AlgebraLinear/AlgebraLinear - Relatório 2.docx
@@ -1,27 +1,11 @@
 
 <file path=word/document.xml><?xml version="1.0" encoding="utf-8"?>
-<w:document xmlns:wpc="http://schemas.microsoft.com/office/word/2010/wordprocessingCanvas" xmlns:cx="http://schemas.microsoft.com/office/drawing/2014/chartex" xmlns:cx1="http://schemas.microsoft.com/office/drawing/2015/9/8/chartex" xmlns:cx2="http://schemas.microsoft.com/office/drawing/2015/10/21/chartex" xmlns:cx3="http://schemas.microsoft.com/office/drawing/2016/5/9/chartex" xmlns:cx4="http://schemas.microsoft.com/office/drawing/2016/5/10/chartex" xmlns:cx5="http://schemas.microsoft.com/office/drawing/2016/5/11/chartex" xmlns:cx6="http://schemas.microsoft.com/office/drawing/2016/5/12/chartex" xmlns:cx7="http://schemas.microsoft.com/office/drawing/2016/5/13/chartex" xmlns:cx8="http://schemas.microsoft.com/office/drawing/2016/5/14/chartex" xmlns:mc="http://schemas.openxmlformats.org/markup-compatibility/2006" xmlns:aink="http://schemas.microsoft.com/office/drawing/2016/ink" xmlns:am3d="http://schemas.microsoft.com/office/drawing/2017/model3d" xmlns:o="urn:schemas-microsoft-com:office:office" xmlns:r="http://schemas.openxmlformats.org/officeDocument/2006/relationships" xmlns:m="http://schemas.openxmlformats.org/officeDocument/2006/math" xmlns:v="urn:schemas-microsoft-com:vml" xmlns:wp14="http://schemas.microsoft.com/office/word/2010/wordprocessingDrawing" xmlns:wp="http://schemas.openxmlformats.org/drawingml/2006/wordprocessingDrawing" xmlns:w10="urn:schemas-microsoft-com:office:word" xmlns:w="http://schemas.openxmlformats.org/wordprocessingml/2006/main" xmlns:w14="http://schemas.microsoft.com/office/word/2010/wordml" xmlns:w15="http://schemas.microsoft.com/office/word/2012/wordml" xmlns:w16cid="http://schemas.microsoft.com/office/word/2016/wordml/cid" xmlns:w16se="http://schemas.microsoft.com/office/word/2015/wordml/symex" xmlns:wpg="http://schemas.microsoft.com/office/word/2010/wordprocessingGroup" xmlns:wpi="http://schemas.microsoft.com/office/word/2010/wordprocessingInk" xmlns:wne="http://schemas.microsoft.com/office/word/2006/wordml" xmlns:wps="http://schemas.microsoft.com/office/word/2010/wordprocessingShape" mc:Ignorable="w14 w15 w16se w16cid wp14">
+<w:document xmlns:wpc="http://schemas.microsoft.com/office/word/2010/wordprocessingCanvas" xmlns:cx="http://schemas.microsoft.com/office/drawing/2014/chartex" xmlns:cx1="http://schemas.microsoft.com/office/drawing/2015/9/8/chartex" xmlns:cx2="http://schemas.microsoft.com/office/drawing/2015/10/21/chartex" xmlns:cx3="http://schemas.microsoft.com/office/drawing/2016/5/9/chartex" xmlns:cx4="http://schemas.microsoft.com/office/drawing/2016/5/10/chartex" xmlns:cx5="http://schemas.microsoft.com/office/drawing/2016/5/11/chartex" xmlns:cx6="http://schemas.microsoft.com/office/drawing/2016/5/12/chartex" xmlns:cx7="http://schemas.microsoft.com/office/drawing/2016/5/13/chartex" xmlns:cx8="http://schemas.microsoft.com/office/drawing/2016/5/14/chartex" xmlns:mc="http://schemas.openxmlformats.org/markup-compatibility/2006" xmlns:aink="http://schemas.microsoft.com/office/drawing/2016/ink" xmlns:am3d="http://schemas.microsoft.com/office/drawing/2017/model3d" xmlns:o="urn:schemas-microsoft-com:office:office" xmlns:oel="http://schemas.microsoft.com/office/2019/extlst" xmlns:r="http://schemas.openxmlformats.org/officeDocument/2006/relationships" xmlns:m="http://schemas.openxmlformats.org/officeDocument/2006/math" xmlns:v="urn:schemas-microsoft-com:vml" xmlns:wp14="http://schemas.microsoft.com/office/word/2010/wordprocessingDrawing" xmlns:wp="http://schemas.openxmlformats.org/drawingml/2006/wordprocessingDrawing" xmlns:w10="urn:schemas-microsoft-com:office:word" xmlns:w="http://schemas.openxmlformats.org/wordprocessingml/2006/main" xmlns:w14="http://schemas.microsoft.com/office/word/2010/wordml" xmlns:w15="http://schemas.microsoft.com/office/word/2012/wordml" xmlns:w16cex="http://schemas.microsoft.com/office/word/2018/wordml/cex" xmlns:w16cid="http://schemas.microsoft.com/office/word/2016/wordml/cid" xmlns:w16="http://schemas.microsoft.com/office/word/2018/wordml" xmlns:w16du="http://schemas.microsoft.com/office/word/2023/wordml/word16du" xmlns:w16sdtdh="http://schemas.microsoft.com/office/word/2020/wordml/sdtdatahash" xmlns:w16sdtfl="http://schemas.microsoft.com/office/word/2024/wordml/sdtformatlock" xmlns:w16se="http://schemas.microsoft.com/office/word/2015/wordml/symex" xmlns:wpg="http://schemas.microsoft.com/office/word/2010/wordprocessingGroup" xmlns:wpi="http://schemas.microsoft.com/office/word/2010/wordprocessingInk" xmlns:wne="http://schemas.microsoft.com/office/word/2006/wordml" xmlns:wps="http://schemas.microsoft.com/office/word/2010/wordprocessingShape" mc:Ignorable="w14 w15 w16se w16cid w16 w16cex w16sdtdh w16sdtfl w16du wp14">
   <w:body>
     <w:p>
       <w:pPr>
         <w:spacing w:before="60" w:after="60"/>
       </w:pPr>
-    </w:p>
-    <w:p>
-      <w:pPr>
-        <w:spacing w:before="200" w:after="120"/>
-        <w:jc w:val="center"/>
-      </w:pPr>
-      <w:r>
-        <w:rPr>
-          <w:b/>
-          <w:bCs/>
-          <w:color w:val="1F3864"/>
-          <w:sz w:val="52"/>
-          <w:szCs w:val="52"/>
-        </w:rPr>
-        <w:t>Entregável 2</w:t>
-      </w:r>
     </w:p>
     <w:p>
       <w:pPr>
@@ -82,57 +66,47 @@
     </w:p>
     <w:p>
       <w:pPr>
-        <w:spacing w:before="40" w:after="40"/>
+        <w:spacing w:before="60" w:after="60"/>
         <w:jc w:val="center"/>
       </w:pPr>
       <w:r>
-        <w:t xml:space="preserve">Felipe </w:t>
+        <w:t>Felipe Vallim Soares — RA: 24026060</w:t>
+      </w:r>
+    </w:p>
+    <w:p>
+      <w:pPr>
+        <w:spacing w:before="60" w:after="60"/>
+        <w:jc w:val="center"/>
+      </w:pPr>
+      <w:r>
+        <w:t>Guilhermy Mariano Lisboa Garcia — RA: 23025371</w:t>
+      </w:r>
+    </w:p>
+    <w:p>
+      <w:pPr>
+        <w:spacing w:before="60" w:after="60"/>
+        <w:jc w:val="center"/>
+      </w:pPr>
+      <w:r>
+        <w:t xml:space="preserve">Gustavo Oliveira </w:t>
       </w:r>
       <w:proofErr w:type="spellStart"/>
       <w:r>
-        <w:t>Vallim</w:t>
+        <w:t>Demetrio</w:t>
       </w:r>
       <w:proofErr w:type="spellEnd"/>
       <w:r>
-        <w:t xml:space="preserve"> Soares</w:t>
-      </w:r>
-    </w:p>
-    <w:p>
-      <w:pPr>
-        <w:spacing w:before="40" w:after="40"/>
+        <w:t xml:space="preserve"> — RA: 24026213</w:t>
+      </w:r>
+    </w:p>
+    <w:p>
+      <w:pPr>
+        <w:spacing w:before="60" w:after="60"/>
         <w:jc w:val="center"/>
       </w:pPr>
       <w:r>
-        <w:t>Guilhermy Mariano Lisboa Garcia</w:t>
-      </w:r>
-    </w:p>
-    <w:p>
-      <w:pPr>
-        <w:spacing w:before="40" w:after="40"/>
-        <w:jc w:val="center"/>
-      </w:pPr>
-      <w:r>
-        <w:t xml:space="preserve">Gustavo Oliveira </w:t>
-      </w:r>
-      <w:proofErr w:type="spellStart"/>
-      <w:r>
-        <w:t>Demetrio</w:t>
-      </w:r>
-      <w:proofErr w:type="spellEnd"/>
-    </w:p>
-    <w:p>
-      <w:pPr>
-        <w:spacing w:before="40" w:after="40"/>
-        <w:jc w:val="center"/>
-      </w:pPr>
-      <w:r>
-        <w:t>Saulo Pereira de Jesus</w:t>
-      </w:r>
-    </w:p>
-    <w:p>
-      <w:pPr>
-        <w:spacing w:before="60" w:after="60"/>
-      </w:pPr>
+        <w:t>Saulo Pereira de Jesus — RA: 24026095</w:t>
+      </w:r>
     </w:p>
     <w:p>
       <w:pPr>
@@ -200,10 +174,7 @@
         <w:jc w:val="both"/>
       </w:pPr>
       <w:r>
-        <w:t>Este trabalho tem como objetivo demonstrar, de forma prática e conceitual, como transformações lineares atuam sobre dados matriciais, evidenciando o papel central da Álgebra Linear na manipulação computacional de imagens digitais. A partir da m</w:t>
-      </w:r>
-      <w:r>
-        <w:t>atriz de pixels extraída no Entregável 1, aplicamos matrizes de transformação geométrica para alterar a configuração espacial da imagem, analisando os efeitos dimensionais e visuais produzidos por cada operação.</w:t>
+        <w:t>Este trabalho tem como objetivo demonstrar, de forma prática e conceitual, como transformações lineares atuam sobre dados matriciais, evidenciando o papel central da Álgebra Linear na manipulação computacional de imagens digitais. A partir da matriz de pixels extraída no Entregável 1, aplicamos matrizes de transformação geométrica para alterar a configuração espacial da imagem, analisando os efeitos dimensionais e visuais produzidos por cada operação.</w:t>
       </w:r>
     </w:p>
     <w:p>
@@ -232,17 +203,11 @@
       </w:r>
       <w:proofErr w:type="gramStart"/>
       <w:r>
-        <w:t>y)</w:t>
-      </w:r>
-      <w:r>
-        <w:t>ᵀ</w:t>
+        <w:t>y)ᵀ</w:t>
       </w:r>
       <w:proofErr w:type="gramEnd"/>
       <w:r>
-        <w:t xml:space="preserve"> e uma matriz A, a transformação resulta em v' = A · v. Para este projeto, foram definidas as quatr</w:t>
-      </w:r>
-      <w:r>
-        <w:t>o transformações descritas a seguir.</w:t>
+        <w:t xml:space="preserve"> e uma matriz A, a transformação resulta em v' = A · v. Para este projeto, foram definidas as quatro transformações descritas a seguir.</w:t>
       </w:r>
     </w:p>
     <w:p>
@@ -302,10 +267,7 @@
         <w:jc w:val="both"/>
       </w:pPr>
       <w:r>
-        <w:t>M</w:t>
-      </w:r>
-      <w:r>
-        <w:t>atriz de Escalonamento S:</w:t>
+        <w:t>Matriz de Escalonamento S:</w:t>
       </w:r>
     </w:p>
     <w:tbl>
@@ -330,12 +292,6 @@
         <w:gridCol w:w="1000"/>
       </w:tblGrid>
       <w:tr>
-        <w:tblPrEx>
-          <w:tblCellMar>
-            <w:top w:w="0" w:type="dxa"/>
-            <w:bottom w:w="0" w:type="dxa"/>
-          </w:tblCellMar>
-        </w:tblPrEx>
         <w:tc>
           <w:tcPr>
             <w:tcW w:w="1000" w:type="dxa"/>
@@ -402,12 +358,6 @@
         </w:tc>
       </w:tr>
       <w:tr>
-        <w:tblPrEx>
-          <w:tblCellMar>
-            <w:top w:w="0" w:type="dxa"/>
-            <w:bottom w:w="0" w:type="dxa"/>
-          </w:tblCellMar>
-        </w:tblPrEx>
         <w:tc>
           <w:tcPr>
             <w:tcW w:w="1000" w:type="dxa"/>
@@ -478,6 +428,11 @@
       <w:pPr>
         <w:spacing w:before="100" w:after="100"/>
         <w:jc w:val="both"/>
+        <w:rPr>
+          <w:i/>
+          <w:iCs/>
+          <w:color w:val="555555"/>
+        </w:rPr>
       </w:pPr>
       <w:r>
         <w:rPr>
@@ -539,28 +494,25 @@
           <w:iCs/>
           <w:color w:val="555555"/>
         </w:rPr>
-        <w:t xml:space="preserve"> = 0,5  → imagem larga e achatada.</w:t>
-      </w:r>
-    </w:p>
-    <w:p>
-      <w:pPr>
-        <w:spacing w:before="60" w:after="60"/>
-      </w:pPr>
-    </w:p>
-    <w:p>
-      <w:pPr>
-        <w:pStyle w:val="Ttulo2"/>
-      </w:pPr>
-      <w:r>
-        <w:t>2.2 Cisalhamento (</w:t>
-      </w:r>
-      <w:proofErr w:type="spellStart"/>
-      <w:r>
-        <w:t>Shearing</w:t>
-      </w:r>
-      <w:proofErr w:type="spellEnd"/>
-      <w:r>
-        <w:t>)</w:t>
+        <w:t xml:space="preserve"> = 0,</w:t>
+      </w:r>
+      <w:proofErr w:type="gramStart"/>
+      <w:r>
+        <w:rPr>
+          <w:i/>
+          <w:iCs/>
+          <w:color w:val="555555"/>
+        </w:rPr>
+        <w:t>5  →</w:t>
+      </w:r>
+      <w:proofErr w:type="gramEnd"/>
+      <w:r>
+        <w:rPr>
+          <w:i/>
+          <w:iCs/>
+          <w:color w:val="555555"/>
+        </w:rPr>
+        <w:t xml:space="preserve"> imagem larga e achatada.</w:t>
       </w:r>
     </w:p>
     <w:p>
@@ -568,14 +520,27 @@
         <w:spacing w:before="100" w:after="100"/>
         <w:jc w:val="both"/>
       </w:pPr>
-      <w:r>
-        <w:t>Distorce a forma geométrica da imagem, deslizando os pontos paralelamente a um eixo. O parâmetro k define a intensidade do cisalhamento. No cisalhamento horizontal, a coordenada x de cada ponto é deslocada proporcionalmente ao seu valor em y.</w:t>
-      </w:r>
     </w:p>
     <w:p>
       <w:pPr>
         <w:spacing w:before="60" w:after="60"/>
       </w:pPr>
+    </w:p>
+    <w:p>
+      <w:pPr>
+        <w:pStyle w:val="Ttulo2"/>
+      </w:pPr>
+      <w:r>
+        <w:t>2.2 Cisalhamento (</w:t>
+      </w:r>
+      <w:proofErr w:type="spellStart"/>
+      <w:r>
+        <w:t>Shearing</w:t>
+      </w:r>
+      <w:proofErr w:type="spellEnd"/>
+      <w:r>
+        <w:t>)</w:t>
+      </w:r>
     </w:p>
     <w:p>
       <w:pPr>
@@ -583,10 +548,21 @@
         <w:jc w:val="both"/>
       </w:pPr>
       <w:r>
-        <w:t>Matriz de Ci</w:t>
-      </w:r>
-      <w:r>
-        <w:t xml:space="preserve">salhamento </w:t>
+        <w:t>Distorce a forma geométrica da imagem, deslizando os pontos paralelamente a um eixo. O parâmetro k define a intensidade do cisalhamento. No cisalhamento horizontal, a coordenada x de cada ponto é deslocada proporcionalmente ao seu valor em y.</w:t>
+      </w:r>
+    </w:p>
+    <w:p>
+      <w:pPr>
+        <w:spacing w:before="60" w:after="60"/>
+      </w:pPr>
+    </w:p>
+    <w:p>
+      <w:pPr>
+        <w:spacing w:before="100" w:after="100"/>
+        <w:jc w:val="both"/>
+      </w:pPr>
+      <w:r>
+        <w:t xml:space="preserve">Matriz de Cisalhamento </w:t>
       </w:r>
       <w:proofErr w:type="spellStart"/>
       <w:r>
@@ -619,12 +595,6 @@
         <w:gridCol w:w="1000"/>
       </w:tblGrid>
       <w:tr>
-        <w:tblPrEx>
-          <w:tblCellMar>
-            <w:top w:w="0" w:type="dxa"/>
-            <w:bottom w:w="0" w:type="dxa"/>
-          </w:tblCellMar>
-        </w:tblPrEx>
         <w:tc>
           <w:tcPr>
             <w:tcW w:w="1000" w:type="dxa"/>
@@ -689,12 +659,6 @@
         </w:tc>
       </w:tr>
       <w:tr>
-        <w:tblPrEx>
-          <w:tblCellMar>
-            <w:top w:w="0" w:type="dxa"/>
-            <w:bottom w:w="0" w:type="dxa"/>
-          </w:tblCellMar>
-        </w:tblPrEx>
         <w:tc>
           <w:tcPr>
             <w:tcW w:w="1000" w:type="dxa"/>
@@ -763,6 +727,11 @@
       <w:pPr>
         <w:spacing w:before="100" w:after="100"/>
         <w:jc w:val="both"/>
+        <w:rPr>
+          <w:i/>
+          <w:iCs/>
+          <w:color w:val="555555"/>
+        </w:rPr>
       </w:pPr>
       <w:r>
         <w:rPr>
@@ -793,27 +762,42 @@
     </w:p>
     <w:p>
       <w:pPr>
-        <w:spacing w:before="60" w:after="60"/>
-      </w:pPr>
-    </w:p>
-    <w:p>
-      <w:pPr>
-        <w:pStyle w:val="Ttulo2"/>
-      </w:pPr>
-      <w:r>
-        <w:t>2.3 Rotação</w:t>
-      </w:r>
-    </w:p>
-    <w:p>
-      <w:pPr>
         <w:spacing w:before="100" w:after="100"/>
         <w:jc w:val="both"/>
-      </w:pPr>
-      <w:r>
-        <w:t xml:space="preserve">Gira todos os pontos da imagem em torno da origem por um ângulo θ (teta). Para evitar que a figura saia do campo de visualização, as coordenadas são centralizadas antes da rotação e reposicionadas após. O determinante desta matriz é sempre igual a 1, pois </w:t>
-      </w:r>
-      <w:r>
-        <w:t>cos²(θ) + sen²(θ) = 1.</w:t>
+        <w:rPr>
+          <w:i/>
+          <w:iCs/>
+          <w:color w:val="555555"/>
+        </w:rPr>
+      </w:pPr>
+    </w:p>
+    <w:p>
+      <w:pPr>
+        <w:spacing w:before="100" w:after="100"/>
+        <w:jc w:val="both"/>
+      </w:pPr>
+    </w:p>
+    <w:p>
+      <w:pPr>
+        <w:spacing w:before="60" w:after="60"/>
+      </w:pPr>
+    </w:p>
+    <w:p>
+      <w:pPr>
+        <w:pStyle w:val="Ttulo2"/>
+      </w:pPr>
+      <w:r>
+        <w:t>2.3 Rotação</w:t>
+      </w:r>
+    </w:p>
+    <w:p>
+      <w:pPr>
+        <w:spacing w:before="100" w:after="100"/>
+        <w:jc w:val="both"/>
+      </w:pPr>
+      <w:r>
+        <w:lastRenderedPageBreak/>
+        <w:t>Gira todos os pontos da imagem em torno da origem por um ângulo θ (teta). Para evitar que a figura saia do campo de visualização, as coordenadas são centralizadas antes da rotação e reposicionadas após. O determinante desta matriz é sempre igual a 1, pois cos²(θ) + sen²(θ) = 1.</w:t>
       </w:r>
     </w:p>
     <w:p>
@@ -852,12 +836,6 @@
         <w:gridCol w:w="1041"/>
       </w:tblGrid>
       <w:tr>
-        <w:tblPrEx>
-          <w:tblCellMar>
-            <w:top w:w="0" w:type="dxa"/>
-            <w:bottom w:w="0" w:type="dxa"/>
-          </w:tblCellMar>
-        </w:tblPrEx>
         <w:tc>
           <w:tcPr>
             <w:tcW w:w="1000" w:type="dxa"/>
@@ -942,12 +920,6 @@
         </w:tc>
       </w:tr>
       <w:tr>
-        <w:tblPrEx>
-          <w:tblCellMar>
-            <w:top w:w="0" w:type="dxa"/>
-            <w:bottom w:w="0" w:type="dxa"/>
-          </w:tblCellMar>
-        </w:tblPrEx>
         <w:tc>
           <w:tcPr>
             <w:tcW w:w="1000" w:type="dxa"/>
@@ -1026,6 +998,11 @@
       <w:pPr>
         <w:spacing w:before="100" w:after="100"/>
         <w:jc w:val="both"/>
+        <w:rPr>
+          <w:i/>
+          <w:iCs/>
+          <w:color w:val="555555"/>
+        </w:rPr>
       </w:pPr>
       <w:r>
         <w:rPr>
@@ -1038,27 +1015,36 @@
     </w:p>
     <w:p>
       <w:pPr>
-        <w:spacing w:before="60" w:after="60"/>
-      </w:pPr>
-    </w:p>
-    <w:p>
-      <w:pPr>
-        <w:pStyle w:val="Ttulo2"/>
-      </w:pPr>
-      <w:r>
-        <w:t>2.4 Projeção — Colapso Dimensional</w:t>
-      </w:r>
-    </w:p>
-    <w:p>
-      <w:pPr>
         <w:spacing w:before="100" w:after="100"/>
         <w:jc w:val="both"/>
-      </w:pPr>
-      <w:r>
-        <w:t>Projeta todos os pontos sobre o eixo X, zerando completamente a componente Y. Esta é a única transformação do con</w:t>
-      </w:r>
-      <w:r>
-        <w:t xml:space="preserve">junto que não é </w:t>
+        <w:rPr>
+          <w:i/>
+          <w:iCs/>
+          <w:color w:val="555555"/>
+        </w:rPr>
+      </w:pPr>
+    </w:p>
+    <w:p>
+      <w:pPr>
+        <w:spacing w:before="100" w:after="100"/>
+        <w:jc w:val="both"/>
+      </w:pPr>
+    </w:p>
+    <w:p>
+      <w:pPr>
+        <w:pStyle w:val="Ttulo2"/>
+      </w:pPr>
+      <w:r>
+        <w:t>2.4 Projeção — Colapso Dimensional</w:t>
+      </w:r>
+    </w:p>
+    <w:p>
+      <w:pPr>
+        <w:spacing w:before="100" w:after="100"/>
+        <w:jc w:val="both"/>
+      </w:pPr>
+      <w:r>
+        <w:t xml:space="preserve">Projeta todos os pontos sobre o eixo X, zerando completamente a componente Y. Esta é a única transformação do conjunto que não é </w:t>
       </w:r>
       <w:proofErr w:type="spellStart"/>
       <w:r>
@@ -1105,12 +1091,6 @@
         <w:gridCol w:w="1000"/>
       </w:tblGrid>
       <w:tr>
-        <w:tblPrEx>
-          <w:tblCellMar>
-            <w:top w:w="0" w:type="dxa"/>
-            <w:bottom w:w="0" w:type="dxa"/>
-          </w:tblCellMar>
-        </w:tblPrEx>
         <w:tc>
           <w:tcPr>
             <w:tcW w:w="1000" w:type="dxa"/>
@@ -1175,12 +1155,6 @@
         </w:tc>
       </w:tr>
       <w:tr>
-        <w:tblPrEx>
-          <w:tblCellMar>
-            <w:top w:w="0" w:type="dxa"/>
-            <w:bottom w:w="0" w:type="dxa"/>
-          </w:tblCellMar>
-        </w:tblPrEx>
         <w:tc>
           <w:tcPr>
             <w:tcW w:w="1000" w:type="dxa"/>
@@ -1249,6 +1223,11 @@
       <w:pPr>
         <w:spacing w:before="100" w:after="100"/>
         <w:jc w:val="both"/>
+        <w:rPr>
+          <w:i/>
+          <w:iCs/>
+          <w:color w:val="555555"/>
+        </w:rPr>
       </w:pPr>
       <w:r>
         <w:rPr>
@@ -1315,18 +1294,16 @@
     </w:p>
     <w:p>
       <w:pPr>
-        <w:spacing w:before="60" w:after="60"/>
-      </w:pPr>
-    </w:p>
-    <w:p>
-      <w:pPr>
         <w:pStyle w:val="Ttulo1"/>
         <w:pBdr>
           <w:bottom w:val="single" w:sz="6" w:space="1" w:color="1F3864"/>
         </w:pBdr>
       </w:pPr>
       <w:r>
-        <w:t>3. Implementação Computacional (Python)</w:t>
+        <w:t>3</w:t>
+      </w:r>
+      <w:r>
+        <w:t>. Visualização dos Resultados</w:t>
       </w:r>
     </w:p>
     <w:p>
@@ -1335,6 +1312,596 @@
         <w:jc w:val="both"/>
       </w:pPr>
       <w:r>
+        <w:t>As figuras abaixo apresentam a imagem original e cada uma das imagens transformadas, geradas pelo código acima. A comparação visual evidencia o impacto direto de cada matriz sobre a configuração espacial dos pixels.</w:t>
+      </w:r>
+    </w:p>
+    <w:p>
+      <w:pPr>
+        <w:spacing w:before="60" w:after="60"/>
+      </w:pPr>
+    </w:p>
+    <w:p>
+      <w:pPr>
+        <w:spacing w:before="120" w:after="60"/>
+        <w:jc w:val="center"/>
+      </w:pPr>
+      <w:r>
+        <w:rPr>
+          <w:noProof/>
+        </w:rPr>
+        <w:drawing>
+          <wp:inline distT="0" distB="0" distL="0" distR="0" wp14:anchorId="120149E9" wp14:editId="567D2D9C">
+            <wp:extent cx="2743200" cy="2857500"/>
+            <wp:effectExtent l="0" t="0" r="0" b="0"/>
+            <wp:docPr id="1" name="Original" descr="Original" title="Original"/>
+            <wp:cNvGraphicFramePr>
+              <a:graphicFrameLocks xmlns:a="http://schemas.openxmlformats.org/drawingml/2006/main" noChangeAspect="1"/>
+            </wp:cNvGraphicFramePr>
+            <a:graphic xmlns:a="http://schemas.openxmlformats.org/drawingml/2006/main">
+              <a:graphicData uri="http://schemas.openxmlformats.org/drawingml/2006/picture">
+                <pic:pic xmlns:pic="http://schemas.openxmlformats.org/drawingml/2006/picture">
+                  <pic:nvPicPr>
+                    <pic:cNvPr id="0" name=""/>
+                    <pic:cNvPicPr>
+                      <a:picLocks noChangeAspect="1" noChangeArrowheads="1"/>
+                    </pic:cNvPicPr>
+                  </pic:nvPicPr>
+                  <pic:blipFill>
+                    <a:blip r:embed="rId7"/>
+                    <a:srcRect/>
+                    <a:stretch>
+                      <a:fillRect/>
+                    </a:stretch>
+                  </pic:blipFill>
+                  <pic:spPr bwMode="auto">
+                    <a:xfrm>
+                      <a:off x="0" y="0"/>
+                      <a:ext cx="2743200" cy="2857500"/>
+                    </a:xfrm>
+                    <a:prstGeom prst="rect">
+                      <a:avLst/>
+                    </a:prstGeom>
+                  </pic:spPr>
+                </pic:pic>
+              </a:graphicData>
+            </a:graphic>
+          </wp:inline>
+        </w:drawing>
+      </w:r>
+    </w:p>
+    <w:p>
+      <w:pPr>
+        <w:spacing w:after="180"/>
+        <w:jc w:val="center"/>
+      </w:pPr>
+      <w:r>
+        <w:rPr>
+          <w:i/>
+          <w:iCs/>
+          <w:color w:val="555555"/>
+          <w:sz w:val="18"/>
+          <w:szCs w:val="18"/>
+        </w:rPr>
+        <w:t>Figura 1 — Imagem original (matriz identidade — nenhuma transformação aplicada)</w:t>
+      </w:r>
+    </w:p>
+    <w:tbl>
+      <w:tblPr>
+        <w:tblW w:w="9026" w:type="dxa"/>
+        <w:tblBorders>
+          <w:top w:val="single" w:sz="4" w:space="0" w:color="auto"/>
+          <w:left w:val="single" w:sz="4" w:space="0" w:color="auto"/>
+          <w:bottom w:val="single" w:sz="4" w:space="0" w:color="auto"/>
+          <w:right w:val="single" w:sz="4" w:space="0" w:color="auto"/>
+          <w:insideH w:val="single" w:sz="4" w:space="0" w:color="auto"/>
+          <w:insideV w:val="single" w:sz="4" w:space="0" w:color="auto"/>
+        </w:tblBorders>
+        <w:tblCellMar>
+          <w:left w:w="10" w:type="dxa"/>
+          <w:right w:w="10" w:type="dxa"/>
+        </w:tblCellMar>
+        <w:tblLook w:val="0000" w:firstRow="0" w:lastRow="0" w:firstColumn="0" w:lastColumn="0" w:noHBand="0" w:noVBand="0"/>
+      </w:tblPr>
+      <w:tblGrid>
+        <w:gridCol w:w="4513"/>
+        <w:gridCol w:w="4513"/>
+      </w:tblGrid>
+      <w:tr>
+        <w:tblPrEx>
+          <w:tblCellMar>
+            <w:top w:w="0" w:type="dxa"/>
+            <w:bottom w:w="0" w:type="dxa"/>
+          </w:tblCellMar>
+        </w:tblPrEx>
+        <w:tc>
+          <w:tcPr>
+            <w:tcW w:w="4513" w:type="dxa"/>
+            <w:tcMar>
+              <w:top w:w="60" w:type="dxa"/>
+              <w:left w:w="100" w:type="dxa"/>
+              <w:bottom w:w="60" w:type="dxa"/>
+              <w:right w:w="100" w:type="dxa"/>
+            </w:tcMar>
+          </w:tcPr>
+          <w:p>
+            <w:pPr>
+              <w:spacing w:before="60" w:after="40"/>
+              <w:jc w:val="center"/>
+            </w:pPr>
+            <w:r>
+              <w:rPr>
+                <w:noProof/>
+              </w:rPr>
+              <w:lastRenderedPageBreak/>
+              <w:drawing>
+                <wp:inline distT="0" distB="0" distL="0" distR="0" wp14:anchorId="1B4B9BD5" wp14:editId="3EA5EBE8">
+                  <wp:extent cx="2095500" cy="2181225"/>
+                  <wp:effectExtent l="0" t="0" r="0" b="0"/>
+                  <wp:docPr id="1117894316" name="Escalonamento (Largo e Achatado)" descr="Escalonamento (Largo e Achatado)" title="Escalonamento (Largo e Achatado)"/>
+                  <wp:cNvGraphicFramePr>
+                    <a:graphicFrameLocks xmlns:a="http://schemas.openxmlformats.org/drawingml/2006/main" noChangeAspect="1"/>
+                  </wp:cNvGraphicFramePr>
+                  <a:graphic xmlns:a="http://schemas.openxmlformats.org/drawingml/2006/main">
+                    <a:graphicData uri="http://schemas.openxmlformats.org/drawingml/2006/picture">
+                      <pic:pic xmlns:pic="http://schemas.openxmlformats.org/drawingml/2006/picture">
+                        <pic:nvPicPr>
+                          <pic:cNvPr id="0" name=""/>
+                          <pic:cNvPicPr>
+                            <a:picLocks noChangeAspect="1" noChangeArrowheads="1"/>
+                          </pic:cNvPicPr>
+                        </pic:nvPicPr>
+                        <pic:blipFill>
+                          <a:blip r:embed="rId8"/>
+                          <a:srcRect/>
+                          <a:stretch>
+                            <a:fillRect/>
+                          </a:stretch>
+                        </pic:blipFill>
+                        <pic:spPr bwMode="auto">
+                          <a:xfrm>
+                            <a:off x="0" y="0"/>
+                            <a:ext cx="2095500" cy="2181225"/>
+                          </a:xfrm>
+                          <a:prstGeom prst="rect">
+                            <a:avLst/>
+                          </a:prstGeom>
+                        </pic:spPr>
+                      </pic:pic>
+                    </a:graphicData>
+                  </a:graphic>
+                </wp:inline>
+              </w:drawing>
+            </w:r>
+          </w:p>
+          <w:p>
+            <w:pPr>
+              <w:spacing w:after="80"/>
+              <w:jc w:val="center"/>
+            </w:pPr>
+            <w:r>
+              <w:rPr>
+                <w:i/>
+                <w:iCs/>
+                <w:color w:val="555555"/>
+                <w:sz w:val="18"/>
+                <w:szCs w:val="18"/>
+              </w:rPr>
+              <w:t>Escalonamento (Largo e Achatado)</w:t>
+            </w:r>
+          </w:p>
+        </w:tc>
+        <w:tc>
+          <w:tcPr>
+            <w:tcW w:w="4513" w:type="dxa"/>
+            <w:tcMar>
+              <w:top w:w="60" w:type="dxa"/>
+              <w:left w:w="100" w:type="dxa"/>
+              <w:bottom w:w="60" w:type="dxa"/>
+              <w:right w:w="100" w:type="dxa"/>
+            </w:tcMar>
+          </w:tcPr>
+          <w:p>
+            <w:pPr>
+              <w:spacing w:before="60" w:after="40"/>
+              <w:jc w:val="center"/>
+            </w:pPr>
+            <w:r>
+              <w:rPr>
+                <w:noProof/>
+              </w:rPr>
+              <w:drawing>
+                <wp:inline distT="0" distB="0" distL="0" distR="0" wp14:anchorId="7E57FF97" wp14:editId="10F53BAB">
+                  <wp:extent cx="2095500" cy="2181225"/>
+                  <wp:effectExtent l="0" t="0" r="0" b="0"/>
+                  <wp:docPr id="1614858543" name="Cisalhamento no Eixo X" descr="Cisalhamento no Eixo X" title="Cisalhamento no Eixo X"/>
+                  <wp:cNvGraphicFramePr>
+                    <a:graphicFrameLocks xmlns:a="http://schemas.openxmlformats.org/drawingml/2006/main" noChangeAspect="1"/>
+                  </wp:cNvGraphicFramePr>
+                  <a:graphic xmlns:a="http://schemas.openxmlformats.org/drawingml/2006/main">
+                    <a:graphicData uri="http://schemas.openxmlformats.org/drawingml/2006/picture">
+                      <pic:pic xmlns:pic="http://schemas.openxmlformats.org/drawingml/2006/picture">
+                        <pic:nvPicPr>
+                          <pic:cNvPr id="0" name=""/>
+                          <pic:cNvPicPr>
+                            <a:picLocks noChangeAspect="1" noChangeArrowheads="1"/>
+                          </pic:cNvPicPr>
+                        </pic:nvPicPr>
+                        <pic:blipFill>
+                          <a:blip r:embed="rId9"/>
+                          <a:srcRect/>
+                          <a:stretch>
+                            <a:fillRect/>
+                          </a:stretch>
+                        </pic:blipFill>
+                        <pic:spPr bwMode="auto">
+                          <a:xfrm>
+                            <a:off x="0" y="0"/>
+                            <a:ext cx="2095500" cy="2181225"/>
+                          </a:xfrm>
+                          <a:prstGeom prst="rect">
+                            <a:avLst/>
+                          </a:prstGeom>
+                        </pic:spPr>
+                      </pic:pic>
+                    </a:graphicData>
+                  </a:graphic>
+                </wp:inline>
+              </w:drawing>
+            </w:r>
+          </w:p>
+          <w:p>
+            <w:pPr>
+              <w:spacing w:after="80"/>
+              <w:jc w:val="center"/>
+            </w:pPr>
+            <w:r>
+              <w:rPr>
+                <w:i/>
+                <w:iCs/>
+                <w:color w:val="555555"/>
+                <w:sz w:val="18"/>
+                <w:szCs w:val="18"/>
+              </w:rPr>
+              <w:t>Cisalhamento no Eixo X</w:t>
+            </w:r>
+          </w:p>
+        </w:tc>
+      </w:tr>
+    </w:tbl>
+    <w:p>
+      <w:pPr>
+        <w:spacing w:after="180"/>
+        <w:jc w:val="center"/>
+      </w:pPr>
+      <w:r>
+        <w:rPr>
+          <w:i/>
+          <w:iCs/>
+          <w:color w:val="555555"/>
+          <w:sz w:val="18"/>
+          <w:szCs w:val="18"/>
+        </w:rPr>
+        <w:t>Figura 2 — Escalonamento (</w:t>
+      </w:r>
+      <w:proofErr w:type="spellStart"/>
+      <w:r>
+        <w:rPr>
+          <w:i/>
+          <w:iCs/>
+          <w:color w:val="555555"/>
+          <w:sz w:val="18"/>
+          <w:szCs w:val="18"/>
+        </w:rPr>
+        <w:t>sx</w:t>
+      </w:r>
+      <w:proofErr w:type="spellEnd"/>
+      <w:r>
+        <w:rPr>
+          <w:i/>
+          <w:iCs/>
+          <w:color w:val="555555"/>
+          <w:sz w:val="18"/>
+          <w:szCs w:val="18"/>
+        </w:rPr>
+        <w:t xml:space="preserve">=1,5; </w:t>
+      </w:r>
+      <w:proofErr w:type="spellStart"/>
+      <w:r>
+        <w:rPr>
+          <w:i/>
+          <w:iCs/>
+          <w:color w:val="555555"/>
+          <w:sz w:val="18"/>
+          <w:szCs w:val="18"/>
+        </w:rPr>
+        <w:t>sy</w:t>
+      </w:r>
+      <w:proofErr w:type="spellEnd"/>
+      <w:r>
+        <w:rPr>
+          <w:i/>
+          <w:iCs/>
+          <w:color w:val="555555"/>
+          <w:sz w:val="18"/>
+          <w:szCs w:val="18"/>
+        </w:rPr>
+        <w:t>=0,5</w:t>
+      </w:r>
+      <w:proofErr w:type="gramStart"/>
+      <w:r>
+        <w:rPr>
+          <w:i/>
+          <w:iCs/>
+          <w:color w:val="555555"/>
+          <w:sz w:val="18"/>
+          <w:szCs w:val="18"/>
+        </w:rPr>
+        <w:t>)  ·</w:t>
+      </w:r>
+      <w:proofErr w:type="gramEnd"/>
+      <w:r>
+        <w:rPr>
+          <w:i/>
+          <w:iCs/>
+          <w:color w:val="555555"/>
+          <w:sz w:val="18"/>
+          <w:szCs w:val="18"/>
+        </w:rPr>
+        <w:t xml:space="preserve">  Figura 3 — Cisalhamento (k=0,5)</w:t>
+      </w:r>
+    </w:p>
+    <w:tbl>
+      <w:tblPr>
+        <w:tblW w:w="9026" w:type="dxa"/>
+        <w:tblBorders>
+          <w:top w:val="single" w:sz="4" w:space="0" w:color="auto"/>
+          <w:left w:val="single" w:sz="4" w:space="0" w:color="auto"/>
+          <w:bottom w:val="single" w:sz="4" w:space="0" w:color="auto"/>
+          <w:right w:val="single" w:sz="4" w:space="0" w:color="auto"/>
+          <w:insideH w:val="single" w:sz="4" w:space="0" w:color="auto"/>
+          <w:insideV w:val="single" w:sz="4" w:space="0" w:color="auto"/>
+        </w:tblBorders>
+        <w:tblCellMar>
+          <w:left w:w="10" w:type="dxa"/>
+          <w:right w:w="10" w:type="dxa"/>
+        </w:tblCellMar>
+        <w:tblLook w:val="0000" w:firstRow="0" w:lastRow="0" w:firstColumn="0" w:lastColumn="0" w:noHBand="0" w:noVBand="0"/>
+      </w:tblPr>
+      <w:tblGrid>
+        <w:gridCol w:w="4513"/>
+        <w:gridCol w:w="4513"/>
+      </w:tblGrid>
+      <w:tr>
+        <w:tblPrEx>
+          <w:tblCellMar>
+            <w:top w:w="0" w:type="dxa"/>
+            <w:bottom w:w="0" w:type="dxa"/>
+          </w:tblCellMar>
+        </w:tblPrEx>
+        <w:tc>
+          <w:tcPr>
+            <w:tcW w:w="4513" w:type="dxa"/>
+            <w:tcMar>
+              <w:top w:w="60" w:type="dxa"/>
+              <w:left w:w="100" w:type="dxa"/>
+              <w:bottom w:w="60" w:type="dxa"/>
+              <w:right w:w="100" w:type="dxa"/>
+            </w:tcMar>
+          </w:tcPr>
+          <w:p>
+            <w:pPr>
+              <w:spacing w:before="60" w:after="40"/>
+              <w:jc w:val="center"/>
+            </w:pPr>
+            <w:r>
+              <w:rPr>
+                <w:noProof/>
+              </w:rPr>
+              <w:drawing>
+                <wp:inline distT="0" distB="0" distL="0" distR="0" wp14:anchorId="2AFED3AF" wp14:editId="0D0B9BC5">
+                  <wp:extent cx="2095500" cy="2181225"/>
+                  <wp:effectExtent l="0" t="0" r="0" b="0"/>
+                  <wp:docPr id="323459786" name="Rotação de 45 Graus" descr="Rotação de 45 Graus" title="Rotação de 45 Graus"/>
+                  <wp:cNvGraphicFramePr>
+                    <a:graphicFrameLocks xmlns:a="http://schemas.openxmlformats.org/drawingml/2006/main" noChangeAspect="1"/>
+                  </wp:cNvGraphicFramePr>
+                  <a:graphic xmlns:a="http://schemas.openxmlformats.org/drawingml/2006/main">
+                    <a:graphicData uri="http://schemas.openxmlformats.org/drawingml/2006/picture">
+                      <pic:pic xmlns:pic="http://schemas.openxmlformats.org/drawingml/2006/picture">
+                        <pic:nvPicPr>
+                          <pic:cNvPr id="0" name=""/>
+                          <pic:cNvPicPr>
+                            <a:picLocks noChangeAspect="1" noChangeArrowheads="1"/>
+                          </pic:cNvPicPr>
+                        </pic:nvPicPr>
+                        <pic:blipFill>
+                          <a:blip r:embed="rId10"/>
+                          <a:srcRect/>
+                          <a:stretch>
+                            <a:fillRect/>
+                          </a:stretch>
+                        </pic:blipFill>
+                        <pic:spPr bwMode="auto">
+                          <a:xfrm>
+                            <a:off x="0" y="0"/>
+                            <a:ext cx="2095500" cy="2181225"/>
+                          </a:xfrm>
+                          <a:prstGeom prst="rect">
+                            <a:avLst/>
+                          </a:prstGeom>
+                        </pic:spPr>
+                      </pic:pic>
+                    </a:graphicData>
+                  </a:graphic>
+                </wp:inline>
+              </w:drawing>
+            </w:r>
+          </w:p>
+          <w:p>
+            <w:pPr>
+              <w:spacing w:after="80"/>
+              <w:jc w:val="center"/>
+            </w:pPr>
+            <w:r>
+              <w:rPr>
+                <w:i/>
+                <w:iCs/>
+                <w:color w:val="555555"/>
+                <w:sz w:val="18"/>
+                <w:szCs w:val="18"/>
+              </w:rPr>
+              <w:t>Rotação de 45 Graus</w:t>
+            </w:r>
+          </w:p>
+        </w:tc>
+        <w:tc>
+          <w:tcPr>
+            <w:tcW w:w="4513" w:type="dxa"/>
+            <w:tcMar>
+              <w:top w:w="60" w:type="dxa"/>
+              <w:left w:w="100" w:type="dxa"/>
+              <w:bottom w:w="60" w:type="dxa"/>
+              <w:right w:w="100" w:type="dxa"/>
+            </w:tcMar>
+          </w:tcPr>
+          <w:p>
+            <w:pPr>
+              <w:spacing w:before="60" w:after="40"/>
+              <w:jc w:val="center"/>
+            </w:pPr>
+            <w:r>
+              <w:rPr>
+                <w:noProof/>
+              </w:rPr>
+              <w:drawing>
+                <wp:inline distT="0" distB="0" distL="0" distR="0" wp14:anchorId="11639B14" wp14:editId="3540FED2">
+                  <wp:extent cx="2095500" cy="2181225"/>
+                  <wp:effectExtent l="0" t="0" r="0" b="0"/>
+                  <wp:docPr id="1663976784" name="Colapso Dimensional (Projeção no Eixo X)" descr="Colapso Dimensional (Projeção no Eixo X)" title="Colapso Dimensional (Projeção no Eixo X)"/>
+                  <wp:cNvGraphicFramePr>
+                    <a:graphicFrameLocks xmlns:a="http://schemas.openxmlformats.org/drawingml/2006/main" noChangeAspect="1"/>
+                  </wp:cNvGraphicFramePr>
+                  <a:graphic xmlns:a="http://schemas.openxmlformats.org/drawingml/2006/main">
+                    <a:graphicData uri="http://schemas.openxmlformats.org/drawingml/2006/picture">
+                      <pic:pic xmlns:pic="http://schemas.openxmlformats.org/drawingml/2006/picture">
+                        <pic:nvPicPr>
+                          <pic:cNvPr id="0" name=""/>
+                          <pic:cNvPicPr>
+                            <a:picLocks noChangeAspect="1" noChangeArrowheads="1"/>
+                          </pic:cNvPicPr>
+                        </pic:nvPicPr>
+                        <pic:blipFill>
+                          <a:blip r:embed="rId11"/>
+                          <a:srcRect/>
+                          <a:stretch>
+                            <a:fillRect/>
+                          </a:stretch>
+                        </pic:blipFill>
+                        <pic:spPr bwMode="auto">
+                          <a:xfrm>
+                            <a:off x="0" y="0"/>
+                            <a:ext cx="2095500" cy="2181225"/>
+                          </a:xfrm>
+                          <a:prstGeom prst="rect">
+                            <a:avLst/>
+                          </a:prstGeom>
+                        </pic:spPr>
+                      </pic:pic>
+                    </a:graphicData>
+                  </a:graphic>
+                </wp:inline>
+              </w:drawing>
+            </w:r>
+          </w:p>
+          <w:p>
+            <w:pPr>
+              <w:spacing w:after="80"/>
+              <w:jc w:val="center"/>
+            </w:pPr>
+            <w:r>
+              <w:rPr>
+                <w:i/>
+                <w:iCs/>
+                <w:color w:val="555555"/>
+                <w:sz w:val="18"/>
+                <w:szCs w:val="18"/>
+              </w:rPr>
+              <w:t>Colapso Dimensional (Projeção no Eixo X)</w:t>
+            </w:r>
+          </w:p>
+        </w:tc>
+      </w:tr>
+    </w:tbl>
+    <w:p>
+      <w:pPr>
+        <w:spacing w:after="180"/>
+        <w:jc w:val="center"/>
+      </w:pPr>
+      <w:r>
+        <w:rPr>
+          <w:i/>
+          <w:iCs/>
+          <w:color w:val="555555"/>
+          <w:sz w:val="18"/>
+          <w:szCs w:val="18"/>
+        </w:rPr>
+        <w:t>Figura 4 — Rotação de 45</w:t>
+      </w:r>
+      <w:proofErr w:type="gramStart"/>
+      <w:r>
+        <w:rPr>
+          <w:i/>
+          <w:iCs/>
+          <w:color w:val="555555"/>
+          <w:sz w:val="18"/>
+          <w:szCs w:val="18"/>
+        </w:rPr>
+        <w:t>°  ·</w:t>
+      </w:r>
+      <w:proofErr w:type="gramEnd"/>
+      <w:r>
+        <w:rPr>
+          <w:i/>
+          <w:iCs/>
+          <w:color w:val="555555"/>
+          <w:sz w:val="18"/>
+          <w:szCs w:val="18"/>
+        </w:rPr>
+        <w:t xml:space="preserve">  Figura 5 — Colapso Dimensional (Projeção no Eixo X)</w:t>
+      </w:r>
+    </w:p>
+    <w:p>
+      <w:pPr>
+        <w:spacing w:before="100" w:after="100"/>
+        <w:jc w:val="both"/>
+      </w:pPr>
+    </w:p>
+    <w:p>
+      <w:pPr>
+        <w:spacing w:before="100" w:after="100"/>
+        <w:jc w:val="both"/>
+      </w:pPr>
+    </w:p>
+    <w:p>
+      <w:pPr>
+        <w:pStyle w:val="Ttulo1"/>
+        <w:pBdr>
+          <w:bottom w:val="single" w:sz="6" w:space="1" w:color="1F3864"/>
+        </w:pBdr>
+      </w:pPr>
+      <w:r>
+        <w:t>4</w:t>
+      </w:r>
+      <w:r>
+        <w:t>. Implementação Computacional (Python)</w:t>
+      </w:r>
+    </w:p>
+    <w:p>
+      <w:pPr>
+        <w:spacing w:before="100" w:after="100"/>
+        <w:jc w:val="both"/>
+      </w:pPr>
+      <w:r>
         <w:t xml:space="preserve">A implementação foi realizada em Python, utilizando as bibliotecas </w:t>
       </w:r>
       <w:proofErr w:type="spellStart"/>
@@ -1351,10 +1918,7 @@
       </w:r>
       <w:proofErr w:type="spellEnd"/>
       <w:r>
-        <w:t xml:space="preserve"> (visualização). O algoritmo centraliza as coordenadas dos pixels antes de cada transformação para garantir que</w:t>
-      </w:r>
-      <w:r>
-        <w:t xml:space="preserve"> as rotações e cisalhamentos ocorram em torno do centro da imagem.</w:t>
+        <w:t xml:space="preserve"> (visualização). O algoritmo centraliza as coordenadas dos pixels antes de cada transformação para garantir que as rotações e cisalhamentos ocorram em torno do centro da imagem.</w:t>
       </w:r>
     </w:p>
     <w:p>
@@ -1490,12 +2054,6 @@
         <w:gridCol w:w="9026"/>
       </w:tblGrid>
       <w:tr>
-        <w:tblPrEx>
-          <w:tblCellMar>
-            <w:top w:w="0" w:type="dxa"/>
-            <w:bottom w:w="0" w:type="dxa"/>
-          </w:tblCellMar>
-        </w:tblPrEx>
         <w:tc>
           <w:tcPr>
             <w:tcW w:w="9026" w:type="dxa"/>
@@ -1516,15 +2074,44 @@
           <w:p>
             <w:pPr>
               <w:spacing w:before="40"/>
-            </w:pPr>
+              <w:rPr>
+                <w:lang w:val="en-US"/>
+              </w:rPr>
+            </w:pPr>
+            <w:r>
+              <w:rPr>
+                <w:rFonts w:ascii="Courier New" w:eastAsia="Courier New" w:hAnsi="Courier New" w:cs="Courier New"/>
+                <w:sz w:val="18"/>
+                <w:szCs w:val="18"/>
+                <w:lang w:val="en-US"/>
+              </w:rPr>
+              <w:t>import pandas as pd</w:t>
+            </w:r>
+          </w:p>
+          <w:p>
+            <w:pPr>
+              <w:rPr>
+                <w:lang w:val="en-US"/>
+              </w:rPr>
+            </w:pPr>
+            <w:r>
+              <w:rPr>
+                <w:rFonts w:ascii="Courier New" w:eastAsia="Courier New" w:hAnsi="Courier New" w:cs="Courier New"/>
+                <w:sz w:val="18"/>
+                <w:szCs w:val="18"/>
+                <w:lang w:val="en-US"/>
+              </w:rPr>
+              <w:t xml:space="preserve">import </w:t>
+            </w:r>
             <w:proofErr w:type="spellStart"/>
             <w:r>
               <w:rPr>
                 <w:rFonts w:ascii="Courier New" w:eastAsia="Courier New" w:hAnsi="Courier New" w:cs="Courier New"/>
                 <w:sz w:val="18"/>
                 <w:szCs w:val="18"/>
-              </w:rPr>
-              <w:t>import</w:t>
+                <w:lang w:val="en-US"/>
+              </w:rPr>
+              <w:t>numpy</w:t>
             </w:r>
             <w:proofErr w:type="spellEnd"/>
             <w:r>
@@ -1532,86 +2119,25 @@
                 <w:rFonts w:ascii="Courier New" w:eastAsia="Courier New" w:hAnsi="Courier New" w:cs="Courier New"/>
                 <w:sz w:val="18"/>
                 <w:szCs w:val="18"/>
-              </w:rPr>
-              <w:t xml:space="preserve"> pandas as </w:t>
-            </w:r>
-            <w:proofErr w:type="spellStart"/>
-            <w:r>
-              <w:rPr>
-                <w:rFonts w:ascii="Courier New" w:eastAsia="Courier New" w:hAnsi="Courier New" w:cs="Courier New"/>
-                <w:sz w:val="18"/>
-                <w:szCs w:val="18"/>
-              </w:rPr>
-              <w:t>pd</w:t>
-            </w:r>
-            <w:proofErr w:type="spellEnd"/>
-          </w:p>
-          <w:p>
-            <w:proofErr w:type="spellStart"/>
-            <w:r>
-              <w:rPr>
-                <w:rFonts w:ascii="Courier New" w:eastAsia="Courier New" w:hAnsi="Courier New" w:cs="Courier New"/>
-                <w:sz w:val="18"/>
-                <w:szCs w:val="18"/>
-              </w:rPr>
-              <w:t>import</w:t>
-            </w:r>
-            <w:proofErr w:type="spellEnd"/>
-            <w:r>
-              <w:rPr>
-                <w:rFonts w:ascii="Courier New" w:eastAsia="Courier New" w:hAnsi="Courier New" w:cs="Courier New"/>
-                <w:sz w:val="18"/>
-                <w:szCs w:val="18"/>
-              </w:rPr>
-              <w:t xml:space="preserve"> </w:t>
-            </w:r>
-            <w:proofErr w:type="spellStart"/>
-            <w:r>
-              <w:rPr>
-                <w:rFonts w:ascii="Courier New" w:eastAsia="Courier New" w:hAnsi="Courier New" w:cs="Courier New"/>
-                <w:sz w:val="18"/>
-                <w:szCs w:val="18"/>
-              </w:rPr>
-              <w:t>numpy</w:t>
-            </w:r>
-            <w:proofErr w:type="spellEnd"/>
-            <w:r>
-              <w:rPr>
-                <w:rFonts w:ascii="Courier New" w:eastAsia="Courier New" w:hAnsi="Courier New" w:cs="Courier New"/>
-                <w:sz w:val="18"/>
-                <w:szCs w:val="18"/>
-              </w:rPr>
-              <w:t xml:space="preserve"> as </w:t>
-            </w:r>
-            <w:proofErr w:type="spellStart"/>
-            <w:r>
-              <w:rPr>
-                <w:rFonts w:ascii="Courier New" w:eastAsia="Courier New" w:hAnsi="Courier New" w:cs="Courier New"/>
-                <w:sz w:val="18"/>
-                <w:szCs w:val="18"/>
-              </w:rPr>
-              <w:t>np</w:t>
-            </w:r>
-            <w:proofErr w:type="spellEnd"/>
-          </w:p>
-          <w:p>
-            <w:proofErr w:type="spellStart"/>
-            <w:r>
-              <w:rPr>
-                <w:rFonts w:ascii="Courier New" w:eastAsia="Courier New" w:hAnsi="Courier New" w:cs="Courier New"/>
-                <w:sz w:val="18"/>
-                <w:szCs w:val="18"/>
-              </w:rPr>
-              <w:t>import</w:t>
-            </w:r>
-            <w:proofErr w:type="spellEnd"/>
-            <w:r>
-              <w:rPr>
-                <w:rFonts w:ascii="Courier New" w:eastAsia="Courier New" w:hAnsi="Courier New" w:cs="Courier New"/>
-                <w:sz w:val="18"/>
-                <w:szCs w:val="18"/>
-              </w:rPr>
-              <w:t xml:space="preserve"> </w:t>
+                <w:lang w:val="en-US"/>
+              </w:rPr>
+              <w:t xml:space="preserve"> as np</w:t>
+            </w:r>
+          </w:p>
+          <w:p>
+            <w:pPr>
+              <w:rPr>
+                <w:lang w:val="en-US"/>
+              </w:rPr>
+            </w:pPr>
+            <w:r>
+              <w:rPr>
+                <w:rFonts w:ascii="Courier New" w:eastAsia="Courier New" w:hAnsi="Courier New" w:cs="Courier New"/>
+                <w:sz w:val="18"/>
+                <w:szCs w:val="18"/>
+                <w:lang w:val="en-US"/>
+              </w:rPr>
+              <w:t xml:space="preserve">import </w:t>
             </w:r>
             <w:proofErr w:type="spellStart"/>
             <w:proofErr w:type="gramStart"/>
@@ -1620,16 +2146,9 @@
                 <w:rFonts w:ascii="Courier New" w:eastAsia="Courier New" w:hAnsi="Courier New" w:cs="Courier New"/>
                 <w:sz w:val="18"/>
                 <w:szCs w:val="18"/>
-              </w:rPr>
-              <w:t>mat</w:t>
-            </w:r>
-            <w:r>
-              <w:rPr>
-                <w:rFonts w:ascii="Courier New" w:eastAsia="Courier New" w:hAnsi="Courier New" w:cs="Courier New"/>
-                <w:sz w:val="18"/>
-                <w:szCs w:val="18"/>
-              </w:rPr>
-              <w:t>plotlib.pyplot</w:t>
+                <w:lang w:val="en-US"/>
+              </w:rPr>
+              <w:t>matplotlib.pyplot</w:t>
             </w:r>
             <w:proofErr w:type="spellEnd"/>
             <w:proofErr w:type="gramEnd"/>
@@ -1638,6 +2157,7 @@
                 <w:rFonts w:ascii="Courier New" w:eastAsia="Courier New" w:hAnsi="Courier New" w:cs="Courier New"/>
                 <w:sz w:val="18"/>
                 <w:szCs w:val="18"/>
+                <w:lang w:val="en-US"/>
               </w:rPr>
               <w:t xml:space="preserve"> as </w:t>
             </w:r>
@@ -1647,6 +2167,7 @@
                 <w:rFonts w:ascii="Courier New" w:eastAsia="Courier New" w:hAnsi="Courier New" w:cs="Courier New"/>
                 <w:sz w:val="18"/>
                 <w:szCs w:val="18"/>
+                <w:lang w:val="en-US"/>
               </w:rPr>
               <w:t>plt</w:t>
             </w:r>
@@ -1655,6 +2176,26 @@
           <w:p>
             <w:pPr>
               <w:spacing w:after="20"/>
+              <w:rPr>
+                <w:lang w:val="en-US"/>
+              </w:rPr>
+            </w:pPr>
+            <w:r>
+              <w:rPr>
+                <w:rFonts w:ascii="Courier New" w:eastAsia="Courier New" w:hAnsi="Courier New" w:cs="Courier New"/>
+                <w:sz w:val="18"/>
+                <w:szCs w:val="18"/>
+                <w:lang w:val="en-US"/>
+              </w:rPr>
+              <w:t>import math</w:t>
+            </w:r>
+          </w:p>
+          <w:p>
+            <w:pPr>
+              <w:spacing w:before="20"/>
+              <w:rPr>
+                <w:lang w:val="en-US"/>
+              </w:rPr>
             </w:pPr>
             <w:proofErr w:type="spellStart"/>
             <w:r>
@@ -1662,8 +2203,9 @@
                 <w:rFonts w:ascii="Courier New" w:eastAsia="Courier New" w:hAnsi="Courier New" w:cs="Courier New"/>
                 <w:sz w:val="18"/>
                 <w:szCs w:val="18"/>
-              </w:rPr>
-              <w:t>import</w:t>
+                <w:lang w:val="en-US"/>
+              </w:rPr>
+              <w:t>df</w:t>
             </w:r>
             <w:proofErr w:type="spellEnd"/>
             <w:r>
@@ -1671,39 +2213,7 @@
                 <w:rFonts w:ascii="Courier New" w:eastAsia="Courier New" w:hAnsi="Courier New" w:cs="Courier New"/>
                 <w:sz w:val="18"/>
                 <w:szCs w:val="18"/>
-              </w:rPr>
-              <w:t xml:space="preserve"> </w:t>
-            </w:r>
-            <w:proofErr w:type="spellStart"/>
-            <w:r>
-              <w:rPr>
-                <w:rFonts w:ascii="Courier New" w:eastAsia="Courier New" w:hAnsi="Courier New" w:cs="Courier New"/>
-                <w:sz w:val="18"/>
-                <w:szCs w:val="18"/>
-              </w:rPr>
-              <w:t>math</w:t>
-            </w:r>
-            <w:proofErr w:type="spellEnd"/>
-          </w:p>
-          <w:p>
-            <w:pPr>
-              <w:spacing w:before="20"/>
-            </w:pPr>
-            <w:proofErr w:type="spellStart"/>
-            <w:r>
-              <w:rPr>
-                <w:rFonts w:ascii="Courier New" w:eastAsia="Courier New" w:hAnsi="Courier New" w:cs="Courier New"/>
-                <w:sz w:val="18"/>
-                <w:szCs w:val="18"/>
-              </w:rPr>
-              <w:t>df</w:t>
-            </w:r>
-            <w:proofErr w:type="spellEnd"/>
-            <w:r>
-              <w:rPr>
-                <w:rFonts w:ascii="Courier New" w:eastAsia="Courier New" w:hAnsi="Courier New" w:cs="Courier New"/>
-                <w:sz w:val="18"/>
-                <w:szCs w:val="18"/>
+                <w:lang w:val="en-US"/>
               </w:rPr>
               <w:t xml:space="preserve"> = </w:t>
             </w:r>
@@ -1714,6 +2224,7 @@
                 <w:rFonts w:ascii="Courier New" w:eastAsia="Courier New" w:hAnsi="Courier New" w:cs="Courier New"/>
                 <w:sz w:val="18"/>
                 <w:szCs w:val="18"/>
+                <w:lang w:val="en-US"/>
               </w:rPr>
               <w:t>pd.read</w:t>
             </w:r>
@@ -1723,6 +2234,7 @@
                 <w:rFonts w:ascii="Courier New" w:eastAsia="Courier New" w:hAnsi="Courier New" w:cs="Courier New"/>
                 <w:sz w:val="18"/>
                 <w:szCs w:val="18"/>
+                <w:lang w:val="en-US"/>
               </w:rPr>
               <w:t>_csv</w:t>
             </w:r>
@@ -1732,11 +2244,18 @@
                 <w:rFonts w:ascii="Courier New" w:eastAsia="Courier New" w:hAnsi="Courier New" w:cs="Courier New"/>
                 <w:sz w:val="18"/>
                 <w:szCs w:val="18"/>
+                <w:lang w:val="en-US"/>
               </w:rPr>
               <w:t>('pixel_data.csv')</w:t>
             </w:r>
           </w:p>
-          <w:p/>
+          <w:p>
+            <w:pPr>
+              <w:rPr>
+                <w:lang w:val="en-US"/>
+              </w:rPr>
+            </w:pPr>
+          </w:p>
           <w:p>
             <w:proofErr w:type="spellStart"/>
             <w:r>
@@ -1804,6 +2323,11 @@
             </w:r>
           </w:p>
           <w:p>
+            <w:pPr>
+              <w:rPr>
+                <w:lang w:val="es-ES"/>
+              </w:rPr>
+            </w:pPr>
             <w:r>
               <w:rPr>
                 <w:rFonts w:ascii="Courier New" w:eastAsia="Courier New" w:hAnsi="Courier New" w:cs="Courier New"/>
@@ -1818,6 +2342,7 @@
                 <w:rFonts w:ascii="Courier New" w:eastAsia="Courier New" w:hAnsi="Courier New" w:cs="Courier New"/>
                 <w:sz w:val="18"/>
                 <w:szCs w:val="18"/>
+                <w:lang w:val="es-ES"/>
               </w:rPr>
               <w:t>x_c</w:t>
             </w:r>
@@ -1827,6 +2352,7 @@
                 <w:rFonts w:ascii="Courier New" w:eastAsia="Courier New" w:hAnsi="Courier New" w:cs="Courier New"/>
                 <w:sz w:val="18"/>
                 <w:szCs w:val="18"/>
+                <w:lang w:val="es-ES"/>
               </w:rPr>
               <w:t xml:space="preserve"> = </w:t>
             </w:r>
@@ -1836,6 +2362,7 @@
                 <w:rFonts w:ascii="Courier New" w:eastAsia="Courier New" w:hAnsi="Courier New" w:cs="Courier New"/>
                 <w:sz w:val="18"/>
                 <w:szCs w:val="18"/>
+                <w:lang w:val="es-ES"/>
               </w:rPr>
               <w:t>df</w:t>
             </w:r>
@@ -1845,16 +2372,23 @@
                 <w:rFonts w:ascii="Courier New" w:eastAsia="Courier New" w:hAnsi="Courier New" w:cs="Courier New"/>
                 <w:sz w:val="18"/>
                 <w:szCs w:val="18"/>
+                <w:lang w:val="es-ES"/>
               </w:rPr>
               <w:t>['X'] - 25</w:t>
             </w:r>
           </w:p>
           <w:p>
-            <w:r>
-              <w:rPr>
-                <w:rFonts w:ascii="Courier New" w:eastAsia="Courier New" w:hAnsi="Courier New" w:cs="Courier New"/>
-                <w:sz w:val="18"/>
-                <w:szCs w:val="18"/>
+            <w:pPr>
+              <w:rPr>
+                <w:lang w:val="es-ES"/>
+              </w:rPr>
+            </w:pPr>
+            <w:r>
+              <w:rPr>
+                <w:rFonts w:ascii="Courier New" w:eastAsia="Courier New" w:hAnsi="Courier New" w:cs="Courier New"/>
+                <w:sz w:val="18"/>
+                <w:szCs w:val="18"/>
+                <w:lang w:val="es-ES"/>
               </w:rPr>
               <w:t xml:space="preserve">    </w:t>
             </w:r>
@@ -1864,6 +2398,7 @@
                 <w:rFonts w:ascii="Courier New" w:eastAsia="Courier New" w:hAnsi="Courier New" w:cs="Courier New"/>
                 <w:sz w:val="18"/>
                 <w:szCs w:val="18"/>
+                <w:lang w:val="es-ES"/>
               </w:rPr>
               <w:t>y_c</w:t>
             </w:r>
@@ -1873,6 +2408,7 @@
                 <w:rFonts w:ascii="Courier New" w:eastAsia="Courier New" w:hAnsi="Courier New" w:cs="Courier New"/>
                 <w:sz w:val="18"/>
                 <w:szCs w:val="18"/>
+                <w:lang w:val="es-ES"/>
               </w:rPr>
               <w:t xml:space="preserve"> = </w:t>
             </w:r>
@@ -1882,6 +2418,7 @@
                 <w:rFonts w:ascii="Courier New" w:eastAsia="Courier New" w:hAnsi="Courier New" w:cs="Courier New"/>
                 <w:sz w:val="18"/>
                 <w:szCs w:val="18"/>
+                <w:lang w:val="es-ES"/>
               </w:rPr>
               <w:t>df</w:t>
             </w:r>
@@ -1891,6 +2428,7 @@
                 <w:rFonts w:ascii="Courier New" w:eastAsia="Courier New" w:hAnsi="Courier New" w:cs="Courier New"/>
                 <w:sz w:val="18"/>
                 <w:szCs w:val="18"/>
+                <w:lang w:val="es-ES"/>
               </w:rPr>
               <w:t>['Y'] - 25</w:t>
             </w:r>
@@ -1901,6 +2439,7 @@
                 <w:rFonts w:ascii="Courier New" w:eastAsia="Courier New" w:hAnsi="Courier New" w:cs="Courier New"/>
                 <w:sz w:val="18"/>
                 <w:szCs w:val="18"/>
+                <w:lang w:val="es-ES"/>
               </w:rPr>
               <w:t xml:space="preserve">    </w:t>
             </w:r>
@@ -2060,15 +2599,7 @@
                 <w:sz w:val="18"/>
                 <w:szCs w:val="18"/>
               </w:rPr>
-              <w:t>coor</w:t>
-            </w:r>
-            <w:r>
-              <w:rPr>
-                <w:rFonts w:ascii="Courier New" w:eastAsia="Courier New" w:hAnsi="Courier New" w:cs="Courier New"/>
-                <w:sz w:val="18"/>
-                <w:szCs w:val="18"/>
-              </w:rPr>
-              <w:t>ds</w:t>
+              <w:t>coords</w:t>
             </w:r>
             <w:proofErr w:type="spellEnd"/>
             <w:r>
@@ -2086,7 +2617,25 @@
                 <w:sz w:val="18"/>
                 <w:szCs w:val="18"/>
               </w:rPr>
-              <w:t>0, :] + 25</w:t>
+              <w:t>0</w:t>
+            </w:r>
+            <w:proofErr w:type="gramStart"/>
+            <w:r>
+              <w:rPr>
+                <w:rFonts w:ascii="Courier New" w:eastAsia="Courier New" w:hAnsi="Courier New" w:cs="Courier New"/>
+                <w:sz w:val="18"/>
+                <w:szCs w:val="18"/>
+              </w:rPr>
+              <w:t>, :</w:t>
+            </w:r>
+            <w:proofErr w:type="gramEnd"/>
+            <w:r>
+              <w:rPr>
+                <w:rFonts w:ascii="Courier New" w:eastAsia="Courier New" w:hAnsi="Courier New" w:cs="Courier New"/>
+                <w:sz w:val="18"/>
+                <w:szCs w:val="18"/>
+              </w:rPr>
+              <w:t>] + 25</w:t>
             </w:r>
           </w:p>
           <w:p>
@@ -2153,7 +2702,25 @@
                 <w:sz w:val="18"/>
                 <w:szCs w:val="18"/>
               </w:rPr>
-              <w:t>1, :] + 25</w:t>
+              <w:t>1</w:t>
+            </w:r>
+            <w:proofErr w:type="gramStart"/>
+            <w:r>
+              <w:rPr>
+                <w:rFonts w:ascii="Courier New" w:eastAsia="Courier New" w:hAnsi="Courier New" w:cs="Courier New"/>
+                <w:sz w:val="18"/>
+                <w:szCs w:val="18"/>
+              </w:rPr>
+              <w:t>, :</w:t>
+            </w:r>
+            <w:proofErr w:type="gramEnd"/>
+            <w:r>
+              <w:rPr>
+                <w:rFonts w:ascii="Courier New" w:eastAsia="Courier New" w:hAnsi="Courier New" w:cs="Courier New"/>
+                <w:sz w:val="18"/>
+                <w:szCs w:val="18"/>
+              </w:rPr>
+              <w:t>] + 25</w:t>
             </w:r>
           </w:p>
           <w:p>
@@ -2195,23 +2762,32 @@
               <w:t>figsize</w:t>
             </w:r>
             <w:proofErr w:type="spellEnd"/>
-            <w:r>
-              <w:rPr>
-                <w:rFonts w:ascii="Courier New" w:eastAsia="Courier New" w:hAnsi="Courier New" w:cs="Courier New"/>
-                <w:sz w:val="18"/>
-                <w:szCs w:val="18"/>
-              </w:rPr>
-              <w:t>=(6, 6))</w:t>
-            </w:r>
-          </w:p>
-          <w:p>
-            <w:r>
-              <w:rPr>
-                <w:rFonts w:ascii="Courier New" w:eastAsia="Courier New" w:hAnsi="Courier New" w:cs="Courier New"/>
-                <w:sz w:val="18"/>
-                <w:szCs w:val="18"/>
-              </w:rPr>
-              <w:lastRenderedPageBreak/>
+            <w:proofErr w:type="gramStart"/>
+            <w:r>
+              <w:rPr>
+                <w:rFonts w:ascii="Courier New" w:eastAsia="Courier New" w:hAnsi="Courier New" w:cs="Courier New"/>
+                <w:sz w:val="18"/>
+                <w:szCs w:val="18"/>
+              </w:rPr>
+              <w:t>=(</w:t>
+            </w:r>
+            <w:proofErr w:type="gramEnd"/>
+            <w:r>
+              <w:rPr>
+                <w:rFonts w:ascii="Courier New" w:eastAsia="Courier New" w:hAnsi="Courier New" w:cs="Courier New"/>
+                <w:sz w:val="18"/>
+                <w:szCs w:val="18"/>
+              </w:rPr>
+              <w:t>6, 6))</w:t>
+            </w:r>
+          </w:p>
+          <w:p>
+            <w:r>
+              <w:rPr>
+                <w:rFonts w:ascii="Courier New" w:eastAsia="Courier New" w:hAnsi="Courier New" w:cs="Courier New"/>
+                <w:sz w:val="18"/>
+                <w:szCs w:val="18"/>
+              </w:rPr>
               <w:t xml:space="preserve">    </w:t>
             </w:r>
             <w:proofErr w:type="spellStart"/>
@@ -2286,7 +2862,16 @@
                 <w:sz w:val="18"/>
                 <w:szCs w:val="18"/>
               </w:rPr>
-              <w:t>[['R','G','B']].</w:t>
+              <w:t>[['R','G','B']</w:t>
+            </w:r>
+            <w:proofErr w:type="gramStart"/>
+            <w:r>
+              <w:rPr>
+                <w:rFonts w:ascii="Courier New" w:eastAsia="Courier New" w:hAnsi="Courier New" w:cs="Courier New"/>
+                <w:sz w:val="18"/>
+                <w:szCs w:val="18"/>
+              </w:rPr>
+              <w:t>].</w:t>
             </w:r>
             <w:proofErr w:type="spellStart"/>
             <w:r>
@@ -2298,6 +2883,7 @@
               <w:t>values</w:t>
             </w:r>
             <w:proofErr w:type="spellEnd"/>
+            <w:proofErr w:type="gramEnd"/>
             <w:r>
               <w:rPr>
                 <w:rFonts w:ascii="Courier New" w:eastAsia="Courier New" w:hAnsi="Courier New" w:cs="Courier New"/>
@@ -2359,7 +2945,16 @@
                 <w:sz w:val="18"/>
                 <w:szCs w:val="18"/>
               </w:rPr>
-              <w:t>_yaxis</w:t>
+              <w:t>_</w:t>
+            </w:r>
+            <w:proofErr w:type="gramStart"/>
+            <w:r>
+              <w:rPr>
+                <w:rFonts w:ascii="Courier New" w:eastAsia="Courier New" w:hAnsi="Courier New" w:cs="Courier New"/>
+                <w:sz w:val="18"/>
+                <w:szCs w:val="18"/>
+              </w:rPr>
+              <w:t>yaxis</w:t>
             </w:r>
             <w:proofErr w:type="spellEnd"/>
             <w:r>
@@ -2368,7 +2963,16 @@
                 <w:sz w:val="18"/>
                 <w:szCs w:val="18"/>
               </w:rPr>
-              <w:t>()</w:t>
+              <w:t>(</w:t>
+            </w:r>
+            <w:proofErr w:type="gramEnd"/>
+            <w:r>
+              <w:rPr>
+                <w:rFonts w:ascii="Courier New" w:eastAsia="Courier New" w:hAnsi="Courier New" w:cs="Courier New"/>
+                <w:sz w:val="18"/>
+                <w:szCs w:val="18"/>
+              </w:rPr>
+              <w:t>)</w:t>
             </w:r>
           </w:p>
           <w:p>
@@ -2449,6 +3053,7 @@
               <w:t xml:space="preserve">'); </w:t>
             </w:r>
             <w:proofErr w:type="spellStart"/>
+            <w:proofErr w:type="gramStart"/>
             <w:r>
               <w:rPr>
                 <w:rFonts w:ascii="Courier New" w:eastAsia="Courier New" w:hAnsi="Courier New" w:cs="Courier New"/>
@@ -2458,6 +3063,7 @@
               <w:t>plt.axis</w:t>
             </w:r>
             <w:proofErr w:type="spellEnd"/>
+            <w:proofErr w:type="gramEnd"/>
             <w:r>
               <w:rPr>
                 <w:rFonts w:ascii="Courier New" w:eastAsia="Courier New" w:hAnsi="Courier New" w:cs="Courier New"/>
@@ -2467,6 +3073,7 @@
               <w:t xml:space="preserve">('off'); </w:t>
             </w:r>
             <w:proofErr w:type="spellStart"/>
+            <w:proofErr w:type="gramStart"/>
             <w:r>
               <w:rPr>
                 <w:rFonts w:ascii="Courier New" w:eastAsia="Courier New" w:hAnsi="Courier New" w:cs="Courier New"/>
@@ -2476,6 +3083,7 @@
               <w:t>plt.show</w:t>
             </w:r>
             <w:proofErr w:type="spellEnd"/>
+            <w:proofErr w:type="gramEnd"/>
             <w:r>
               <w:rPr>
                 <w:rFonts w:ascii="Courier New" w:eastAsia="Courier New" w:hAnsi="Courier New" w:cs="Courier New"/>
@@ -2488,6 +3096,11 @@
         </w:tc>
       </w:tr>
     </w:tbl>
+    <w:p>
+      <w:pPr>
+        <w:spacing w:before="60" w:after="60"/>
+      </w:pPr>
+    </w:p>
     <w:p>
       <w:pPr>
         <w:spacing w:before="60" w:after="60"/>
@@ -2501,7 +3114,10 @@
         </w:pBdr>
       </w:pPr>
       <w:r>
-        <w:t>4. Análise Conceitual e Dimensional</w:t>
+        <w:t>5</w:t>
+      </w:r>
+      <w:r>
+        <w:t>. Análise Conceitual e Dimensional</w:t>
       </w:r>
     </w:p>
     <w:p>
@@ -2509,7 +3125,10 @@
         <w:pStyle w:val="Ttulo2"/>
       </w:pPr>
       <w:r>
-        <w:t>4.1 Transformações que Preservam o Espaço</w:t>
+        <w:t>5</w:t>
+      </w:r>
+      <w:r>
+        <w:t>.1 Transformações que Preservam o Espaço</w:t>
       </w:r>
     </w:p>
     <w:p>
@@ -2526,10 +3145,7 @@
       </w:r>
       <w:proofErr w:type="spellEnd"/>
       <w:r>
-        <w:t>(A) ≠ 0). Esta propriedade garante que os vetores linearmente independ</w:t>
-      </w:r>
-      <w:r>
-        <w:t>entes da imagem original permaneçam independentes após a transformação. O espaço bidimensional é inteiramente preservado — apenas a forma, a escala ou a orientação da figura são modificadas.</w:t>
+        <w:t>(A) ≠ 0). Esta propriedade garante que os vetores linearmente independentes da imagem original permaneçam independentes após a transformação. O espaço bidimensional é inteiramente preservado — apenas a forma, a escala ou a orientação da figura são modificadas.</w:t>
       </w:r>
     </w:p>
     <w:p>
@@ -2546,10 +3162,7 @@
       </w:r>
       <w:proofErr w:type="spellEnd"/>
       <w:r>
-        <w:t>)</w:t>
-      </w:r>
-      <w:r>
-        <w:t>: é possível recuperar perfeitamente a imagem original multiplicando-se o resultado pela matriz inversa A⁻¹. Nenhuma informação espacial é perdida no processo.</w:t>
+        <w:t>): é possível recuperar perfeitamente a imagem original multiplicando-se o resultado pela matriz inversa A⁻¹. Nenhuma informação espacial é perdida no processo.</w:t>
       </w:r>
     </w:p>
     <w:p>
@@ -2581,12 +3194,6 @@
         <w:gridCol w:w="2526"/>
       </w:tblGrid>
       <w:tr>
-        <w:tblPrEx>
-          <w:tblCellMar>
-            <w:top w:w="0" w:type="dxa"/>
-            <w:bottom w:w="0" w:type="dxa"/>
-          </w:tblCellMar>
-        </w:tblPrEx>
         <w:tc>
           <w:tcPr>
             <w:tcW w:w="2500" w:type="dxa"/>
@@ -2745,12 +3352,6 @@
         </w:tc>
       </w:tr>
       <w:tr>
-        <w:tblPrEx>
-          <w:tblCellMar>
-            <w:top w:w="0" w:type="dxa"/>
-            <w:bottom w:w="0" w:type="dxa"/>
-          </w:tblCellMar>
-        </w:tblPrEx>
         <w:tc>
           <w:tcPr>
             <w:tcW w:w="2500" w:type="dxa"/>
@@ -2930,12 +3531,6 @@
         </w:tc>
       </w:tr>
       <w:tr>
-        <w:tblPrEx>
-          <w:tblCellMar>
-            <w:top w:w="0" w:type="dxa"/>
-            <w:bottom w:w="0" w:type="dxa"/>
-          </w:tblCellMar>
-        </w:tblPrEx>
         <w:tc>
           <w:tcPr>
             <w:tcW w:w="2500" w:type="dxa"/>
@@ -3058,12 +3653,6 @@
         </w:tc>
       </w:tr>
       <w:tr>
-        <w:tblPrEx>
-          <w:tblCellMar>
-            <w:top w:w="0" w:type="dxa"/>
-            <w:bottom w:w="0" w:type="dxa"/>
-          </w:tblCellMar>
-        </w:tblPrEx>
         <w:tc>
           <w:tcPr>
             <w:tcW w:w="2500" w:type="dxa"/>
@@ -3186,12 +3775,6 @@
         </w:tc>
       </w:tr>
       <w:tr>
-        <w:tblPrEx>
-          <w:tblCellMar>
-            <w:top w:w="0" w:type="dxa"/>
-            <w:bottom w:w="0" w:type="dxa"/>
-          </w:tblCellMar>
-        </w:tblPrEx>
         <w:tc>
           <w:tcPr>
             <w:tcW w:w="2500" w:type="dxa"/>
@@ -3324,7 +3907,10 @@
         <w:pStyle w:val="Ttulo2"/>
       </w:pPr>
       <w:r>
-        <w:t>4.2 Transformações com Colapso Dimensional</w:t>
+        <w:t>5</w:t>
+      </w:r>
+      <w:r>
+        <w:t>.2 Transformações com Colapso Dimensional</w:t>
       </w:r>
     </w:p>
     <w:p>
@@ -3341,10 +3927,7 @@
       </w:r>
       <w:proofErr w:type="spellEnd"/>
       <w:r>
-        <w:t xml:space="preserve">(P) = 0, o que revela que a matriz é singular. Isso provoca um colapso dimensional: os dados que antes habitavam um espaço em R² passam a ocupar apenas uma </w:t>
-      </w:r>
-      <w:r>
-        <w:t>linha em R¹.</w:t>
+        <w:t>(P) = 0, o que revela que a matriz é singular. Isso provoca um colapso dimensional: os dados que antes habitavam um espaço em R² passam a ocupar apenas uma linha em R¹.</w:t>
       </w:r>
     </w:p>
     <w:p>
@@ -3353,6 +3936,7 @@
         <w:jc w:val="both"/>
       </w:pPr>
       <w:r>
+        <w:lastRenderedPageBreak/>
         <w:t xml:space="preserve">A consequência prática é irreversível: toda a imagem é sobreposta no eixo X, tornando impossível recuperar a imagem original a partir do resultado transformado. A operação não é </w:t>
       </w:r>
       <w:proofErr w:type="spellStart"/>
@@ -3361,10 +3945,7 @@
       </w:r>
       <w:proofErr w:type="spellEnd"/>
       <w:r>
-        <w:t xml:space="preserve"> porque a matriz P não admite inversa — ela não é bijet</w:t>
-      </w:r>
-      <w:r>
-        <w:t>ora, pois múltiplos pontos distintos do plano são mapeados para o mesmo ponto na reta.</w:t>
+        <w:t xml:space="preserve"> porque a matriz P não admite inversa — ela não é bijetora, pois múltiplos pontos distintos do plano são mapeados para o mesmo ponto na reta.</w:t>
       </w:r>
     </w:p>
     <w:p>
@@ -3377,7 +3958,10 @@
         <w:pStyle w:val="Ttulo2"/>
       </w:pPr>
       <w:r>
-        <w:t>4.3 Impacto Geométrico — Resumo Visual</w:t>
+        <w:t>5</w:t>
+      </w:r>
+      <w:r>
+        <w:t>.3 Impacto Geométrico — Resumo Visual</w:t>
       </w:r>
     </w:p>
     <w:p>
@@ -3416,12 +4000,6 @@
         <w:gridCol w:w="7026"/>
       </w:tblGrid>
       <w:tr>
-        <w:tblPrEx>
-          <w:tblCellMar>
-            <w:top w:w="0" w:type="dxa"/>
-            <w:bottom w:w="0" w:type="dxa"/>
-          </w:tblCellMar>
-        </w:tblPrEx>
         <w:tc>
           <w:tcPr>
             <w:tcW w:w="2000" w:type="dxa"/>
@@ -3487,12 +4065,6 @@
         </w:tc>
       </w:tr>
       <w:tr>
-        <w:tblPrEx>
-          <w:tblCellMar>
-            <w:top w:w="0" w:type="dxa"/>
-            <w:bottom w:w="0" w:type="dxa"/>
-          </w:tblCellMar>
-        </w:tblPrEx>
         <w:tc>
           <w:tcPr>
             <w:tcW w:w="2000" w:type="dxa"/>
@@ -3554,12 +4126,6 @@
         </w:tc>
       </w:tr>
       <w:tr>
-        <w:tblPrEx>
-          <w:tblCellMar>
-            <w:top w:w="0" w:type="dxa"/>
-            <w:bottom w:w="0" w:type="dxa"/>
-          </w:tblCellMar>
-        </w:tblPrEx>
         <w:tc>
           <w:tcPr>
             <w:tcW w:w="2000" w:type="dxa"/>
@@ -3588,7 +4154,6 @@
                 <w:sz w:val="20"/>
                 <w:szCs w:val="20"/>
               </w:rPr>
-              <w:lastRenderedPageBreak/>
               <w:t>Escalonamento</w:t>
             </w:r>
           </w:p>
@@ -3622,12 +4187,6 @@
         </w:tc>
       </w:tr>
       <w:tr>
-        <w:tblPrEx>
-          <w:tblCellMar>
-            <w:top w:w="0" w:type="dxa"/>
-            <w:bottom w:w="0" w:type="dxa"/>
-          </w:tblCellMar>
-        </w:tblPrEx>
         <w:tc>
           <w:tcPr>
             <w:tcW w:w="2000" w:type="dxa"/>
@@ -3689,12 +4248,6 @@
         </w:tc>
       </w:tr>
       <w:tr>
-        <w:tblPrEx>
-          <w:tblCellMar>
-            <w:top w:w="0" w:type="dxa"/>
-            <w:bottom w:w="0" w:type="dxa"/>
-          </w:tblCellMar>
-        </w:tblPrEx>
         <w:tc>
           <w:tcPr>
             <w:tcW w:w="2000" w:type="dxa"/>
@@ -3756,12 +4309,6 @@
         </w:tc>
       </w:tr>
       <w:tr>
-        <w:tblPrEx>
-          <w:tblCellMar>
-            <w:top w:w="0" w:type="dxa"/>
-            <w:bottom w:w="0" w:type="dxa"/>
-          </w:tblCellMar>
-        </w:tblPrEx>
         <w:tc>
           <w:tcPr>
             <w:tcW w:w="2000" w:type="dxa"/>
@@ -3836,7 +4383,10 @@
         </w:pBdr>
       </w:pPr>
       <w:r>
-        <w:t>5. Conclusão</w:t>
+        <w:t>6</w:t>
+      </w:r>
+      <w:r>
+        <w:t>. Conclusão</w:t>
       </w:r>
     </w:p>
     <w:p>
@@ -3845,18 +4395,7 @@
         <w:jc w:val="both"/>
       </w:pPr>
       <w:r>
-        <w:t>Através da aplicação direta de matrizes às coordenadas extraídas de uma imagem digital, torna-se evidente que o processamento gráfico é fundamentalmente baseado na Álgebra Linear. As operações que realizamos abstratamente com matrizes e vetore</w:t>
-      </w:r>
-      <w:r>
-        <w:t xml:space="preserve">s são os mesmos mecanismos matemáticos utilizados por placas de vídeo e softwares de edição profissional para </w:t>
-      </w:r>
-      <w:proofErr w:type="spellStart"/>
-      <w:r>
-        <w:t>renderizar</w:t>
-      </w:r>
-      <w:proofErr w:type="spellEnd"/>
-      <w:r>
-        <w:t>, animar e transformar dados espaciais.</w:t>
+        <w:t>Através da aplicação direta de matrizes às coordenadas extraídas de uma imagem digital, torna-se evidente que o processamento gráfico é fundamentalmente baseado na Álgebra Linear. As operações que realizamos abstratamente com matrizes e vetores são os mesmos mecanismos matemáticos utilizados por placas de vídeo e softwares de edição profissional para renderizar, animar e transformar dados espaciais.</w:t>
       </w:r>
     </w:p>
     <w:p>
@@ -3878,10 +4417,7 @@
         <w:spacing w:before="60" w:after="60"/>
       </w:pPr>
       <w:r>
-        <w:t>A escolha dos valore</w:t>
-      </w:r>
-      <w:r>
-        <w:t>s na matriz de transformação determina diretamente o comportamento geométrico da imagem, desde simples redimensionamentos até rotações e distorções complexas.</w:t>
+        <w:t>A escolha dos valores na matriz de transformação determina diretamente o comportamento geométrico da imagem, desde simples redimensionamentos até rotações e distorções complexas.</w:t>
       </w:r>
     </w:p>
     <w:p>
@@ -3902,10 +4438,7 @@
       </w:r>
       <w:proofErr w:type="spellEnd"/>
       <w:r>
-        <w:t>(A) ≠ 0) preservam a dimensão do espaço e são revers</w:t>
-      </w:r>
-      <w:r>
-        <w:t>íveis, garantindo que nenhuma informação seja perdida.</w:t>
+        <w:t>(A) ≠ 0) preservam a dimensão do espaço e são reversíveis, garantindo que nenhuma informação seja perdida.</w:t>
       </w:r>
     </w:p>
     <w:p>
@@ -3939,10 +4472,7 @@
         <w:spacing w:before="60" w:after="60"/>
       </w:pPr>
       <w:r>
-        <w:t>A multiplicação matricial, operação central da</w:t>
-      </w:r>
-      <w:r>
-        <w:t xml:space="preserve"> Álgebra Linear, é o mecanismo computacional que viabiliza toda a computação gráfica moderna.</w:t>
+        <w:t>A multiplicação matricial, operação central da Álgebra Linear, é o mecanismo computacional que viabiliza toda a computação gráfica moderna.</w:t>
       </w:r>
     </w:p>
     <w:p>
@@ -3956,16 +4486,11 @@
         <w:jc w:val="both"/>
       </w:pPr>
       <w:r>
-        <w:t xml:space="preserve">Conclui-se, portanto, que a Álgebra Linear não é apenas uma ferramenta matemática abstrata, mas sim a linguagem formal que sustenta a modelagem, a transformação </w:t>
-      </w:r>
-      <w:r>
-        <w:t>e a visualização de dados computacionais em aplicações reais — desde o processamento de imagens médicas até a renderização de ambientes em jogos tridimensionais.</w:t>
-      </w:r>
-      <w:bookmarkStart w:id="0" w:name="_GoBack"/>
-      <w:bookmarkEnd w:id="0"/>
+        <w:t>Conclui-se, portanto, que a Álgebra Linear não é apenas uma ferramenta matemática abstrata, mas sim a linguagem formal que sustenta a modelagem, a transformação e a visualização de dados computacionais em aplicações reais — desde o processamento de imagens médicas até a renderização de ambientes em jogos tridimensionais.</w:t>
+      </w:r>
     </w:p>
     <w:sectPr>
-      <w:footerReference w:type="default" r:id="rId7"/>
+      <w:footerReference w:type="default" r:id="rId12"/>
       <w:pgSz w:w="11906" w:h="16838"/>
       <w:pgMar w:top="1440" w:right="1440" w:bottom="1440" w:left="1440" w:header="708" w:footer="708" w:gutter="0"/>
       <w:cols w:space="720"/>
@@ -3976,7 +4501,7 @@
 </file>
 
 <file path=word/endnotes.xml><?xml version="1.0" encoding="utf-8"?>
-<w:endnotes xmlns:wpc="http://schemas.microsoft.com/office/word/2010/wordprocessingCanvas" xmlns:cx="http://schemas.microsoft.com/office/drawing/2014/chartex" xmlns:cx1="http://schemas.microsoft.com/office/drawing/2015/9/8/chartex" xmlns:cx2="http://schemas.microsoft.com/office/drawing/2015/10/21/chartex" xmlns:cx3="http://schemas.microsoft.com/office/drawing/2016/5/9/chartex" xmlns:cx4="http://schemas.microsoft.com/office/drawing/2016/5/10/chartex" xmlns:cx5="http://schemas.microsoft.com/office/drawing/2016/5/11/chartex" xmlns:cx6="http://schemas.microsoft.com/office/drawing/2016/5/12/chartex" xmlns:cx7="http://schemas.microsoft.com/office/drawing/2016/5/13/chartex" xmlns:cx8="http://schemas.microsoft.com/office/drawing/2016/5/14/chartex" xmlns:mc="http://schemas.openxmlformats.org/markup-compatibility/2006" xmlns:aink="http://schemas.microsoft.com/office/drawing/2016/ink" xmlns:am3d="http://schemas.microsoft.com/office/drawing/2017/model3d" xmlns:o="urn:schemas-microsoft-com:office:office" xmlns:r="http://schemas.openxmlformats.org/officeDocument/2006/relationships" xmlns:m="http://schemas.openxmlformats.org/officeDocument/2006/math" xmlns:v="urn:schemas-microsoft-com:vml" xmlns:wp14="http://schemas.microsoft.com/office/word/2010/wordprocessingDrawing" xmlns:wp="http://schemas.openxmlformats.org/drawingml/2006/wordprocessingDrawing" xmlns:w10="urn:schemas-microsoft-com:office:word" xmlns:w="http://schemas.openxmlformats.org/wordprocessingml/2006/main" xmlns:w14="http://schemas.microsoft.com/office/word/2010/wordml" xmlns:w15="http://schemas.microsoft.com/office/word/2012/wordml" xmlns:w16cid="http://schemas.microsoft.com/office/word/2016/wordml/cid" xmlns:w16se="http://schemas.microsoft.com/office/word/2015/wordml/symex" xmlns:wpg="http://schemas.microsoft.com/office/word/2010/wordprocessingGroup" xmlns:wpi="http://schemas.microsoft.com/office/word/2010/wordprocessingInk" xmlns:wne="http://schemas.microsoft.com/office/word/2006/wordml" xmlns:wps="http://schemas.microsoft.com/office/word/2010/wordprocessingShape" mc:Ignorable="w14 w15 w16se w16cid wp14">
+<w:endnotes xmlns:wpc="http://schemas.microsoft.com/office/word/2010/wordprocessingCanvas" xmlns:cx="http://schemas.microsoft.com/office/drawing/2014/chartex" xmlns:cx1="http://schemas.microsoft.com/office/drawing/2015/9/8/chartex" xmlns:cx2="http://schemas.microsoft.com/office/drawing/2015/10/21/chartex" xmlns:cx3="http://schemas.microsoft.com/office/drawing/2016/5/9/chartex" xmlns:cx4="http://schemas.microsoft.com/office/drawing/2016/5/10/chartex" xmlns:cx5="http://schemas.microsoft.com/office/drawing/2016/5/11/chartex" xmlns:cx6="http://schemas.microsoft.com/office/drawing/2016/5/12/chartex" xmlns:cx7="http://schemas.microsoft.com/office/drawing/2016/5/13/chartex" xmlns:cx8="http://schemas.microsoft.com/office/drawing/2016/5/14/chartex" xmlns:mc="http://schemas.openxmlformats.org/markup-compatibility/2006" xmlns:aink="http://schemas.microsoft.com/office/drawing/2016/ink" xmlns:am3d="http://schemas.microsoft.com/office/drawing/2017/model3d" xmlns:o="urn:schemas-microsoft-com:office:office" xmlns:oel="http://schemas.microsoft.com/office/2019/extlst" xmlns:r="http://schemas.openxmlformats.org/officeDocument/2006/relationships" xmlns:m="http://schemas.openxmlformats.org/officeDocument/2006/math" xmlns:v="urn:schemas-microsoft-com:vml" xmlns:wp14="http://schemas.microsoft.com/office/word/2010/wordprocessingDrawing" xmlns:wp="http://schemas.openxmlformats.org/drawingml/2006/wordprocessingDrawing" xmlns:w10="urn:schemas-microsoft-com:office:word" xmlns:w="http://schemas.openxmlformats.org/wordprocessingml/2006/main" xmlns:w14="http://schemas.microsoft.com/office/word/2010/wordml" xmlns:w15="http://schemas.microsoft.com/office/word/2012/wordml" xmlns:w16cex="http://schemas.microsoft.com/office/word/2018/wordml/cex" xmlns:w16cid="http://schemas.microsoft.com/office/word/2016/wordml/cid" xmlns:w16="http://schemas.microsoft.com/office/word/2018/wordml" xmlns:w16du="http://schemas.microsoft.com/office/word/2023/wordml/word16du" xmlns:w16sdtdh="http://schemas.microsoft.com/office/word/2020/wordml/sdtdatahash" xmlns:w16sdtfl="http://schemas.microsoft.com/office/word/2024/wordml/sdtformatlock" xmlns:w16se="http://schemas.microsoft.com/office/word/2015/wordml/symex" xmlns:wpg="http://schemas.microsoft.com/office/word/2010/wordprocessingGroup" xmlns:wpi="http://schemas.microsoft.com/office/word/2010/wordprocessingInk" xmlns:wne="http://schemas.microsoft.com/office/word/2006/wordml" xmlns:wps="http://schemas.microsoft.com/office/word/2010/wordprocessingShape" mc:Ignorable="w14 w15 w16se w16cid w16 w16cex w16sdtdh w16sdtfl w16du wp14">
   <w:endnote w:type="separator" w:id="-1">
     <w:p>
       <w:r>
@@ -3995,7 +4520,7 @@
 </file>
 
 <file path=word/footer1.xml><?xml version="1.0" encoding="utf-8"?>
-<w:ftr xmlns:wpc="http://schemas.microsoft.com/office/word/2010/wordprocessingCanvas" xmlns:cx="http://schemas.microsoft.com/office/drawing/2014/chartex" xmlns:cx1="http://schemas.microsoft.com/office/drawing/2015/9/8/chartex" xmlns:cx2="http://schemas.microsoft.com/office/drawing/2015/10/21/chartex" xmlns:cx3="http://schemas.microsoft.com/office/drawing/2016/5/9/chartex" xmlns:cx4="http://schemas.microsoft.com/office/drawing/2016/5/10/chartex" xmlns:cx5="http://schemas.microsoft.com/office/drawing/2016/5/11/chartex" xmlns:cx6="http://schemas.microsoft.com/office/drawing/2016/5/12/chartex" xmlns:cx7="http://schemas.microsoft.com/office/drawing/2016/5/13/chartex" xmlns:cx8="http://schemas.microsoft.com/office/drawing/2016/5/14/chartex" xmlns:mc="http://schemas.openxmlformats.org/markup-compatibility/2006" xmlns:aink="http://schemas.microsoft.com/office/drawing/2016/ink" xmlns:am3d="http://schemas.microsoft.com/office/drawing/2017/model3d" xmlns:o="urn:schemas-microsoft-com:office:office" xmlns:r="http://schemas.openxmlformats.org/officeDocument/2006/relationships" xmlns:m="http://schemas.openxmlformats.org/officeDocument/2006/math" xmlns:v="urn:schemas-microsoft-com:vml" xmlns:wp14="http://schemas.microsoft.com/office/word/2010/wordprocessingDrawing" xmlns:wp="http://schemas.openxmlformats.org/drawingml/2006/wordprocessingDrawing" xmlns:w10="urn:schemas-microsoft-com:office:word" xmlns:w="http://schemas.openxmlformats.org/wordprocessingml/2006/main" xmlns:w14="http://schemas.microsoft.com/office/word/2010/wordml" xmlns:w15="http://schemas.microsoft.com/office/word/2012/wordml" xmlns:w16cid="http://schemas.microsoft.com/office/word/2016/wordml/cid" xmlns:w16se="http://schemas.microsoft.com/office/word/2015/wordml/symex" xmlns:wpg="http://schemas.microsoft.com/office/word/2010/wordprocessingGroup" xmlns:wpi="http://schemas.microsoft.com/office/word/2010/wordprocessingInk" xmlns:wne="http://schemas.microsoft.com/office/word/2006/wordml" xmlns:wps="http://schemas.microsoft.com/office/word/2010/wordprocessingShape" mc:Ignorable="w14 w15 w16se w16cid wp14">
+<w:ftr xmlns:wpc="http://schemas.microsoft.com/office/word/2010/wordprocessingCanvas" xmlns:cx="http://schemas.microsoft.com/office/drawing/2014/chartex" xmlns:cx1="http://schemas.microsoft.com/office/drawing/2015/9/8/chartex" xmlns:cx2="http://schemas.microsoft.com/office/drawing/2015/10/21/chartex" xmlns:cx3="http://schemas.microsoft.com/office/drawing/2016/5/9/chartex" xmlns:cx4="http://schemas.microsoft.com/office/drawing/2016/5/10/chartex" xmlns:cx5="http://schemas.microsoft.com/office/drawing/2016/5/11/chartex" xmlns:cx6="http://schemas.microsoft.com/office/drawing/2016/5/12/chartex" xmlns:cx7="http://schemas.microsoft.com/office/drawing/2016/5/13/chartex" xmlns:cx8="http://schemas.microsoft.com/office/drawing/2016/5/14/chartex" xmlns:mc="http://schemas.openxmlformats.org/markup-compatibility/2006" xmlns:aink="http://schemas.microsoft.com/office/drawing/2016/ink" xmlns:am3d="http://schemas.microsoft.com/office/drawing/2017/model3d" xmlns:o="urn:schemas-microsoft-com:office:office" xmlns:oel="http://schemas.microsoft.com/office/2019/extlst" xmlns:r="http://schemas.openxmlformats.org/officeDocument/2006/relationships" xmlns:m="http://schemas.openxmlformats.org/officeDocument/2006/math" xmlns:v="urn:schemas-microsoft-com:vml" xmlns:wp14="http://schemas.microsoft.com/office/word/2010/wordprocessingDrawing" xmlns:wp="http://schemas.openxmlformats.org/drawingml/2006/wordprocessingDrawing" xmlns:w10="urn:schemas-microsoft-com:office:word" xmlns:w="http://schemas.openxmlformats.org/wordprocessingml/2006/main" xmlns:w14="http://schemas.microsoft.com/office/word/2010/wordml" xmlns:w15="http://schemas.microsoft.com/office/word/2012/wordml" xmlns:w16cex="http://schemas.microsoft.com/office/word/2018/wordml/cex" xmlns:w16cid="http://schemas.microsoft.com/office/word/2016/wordml/cid" xmlns:w16="http://schemas.microsoft.com/office/word/2018/wordml" xmlns:w16du="http://schemas.microsoft.com/office/word/2023/wordml/word16du" xmlns:w16sdtdh="http://schemas.microsoft.com/office/word/2020/wordml/sdtdatahash" xmlns:w16sdtfl="http://schemas.microsoft.com/office/word/2024/wordml/sdtformatlock" xmlns:w16se="http://schemas.microsoft.com/office/word/2015/wordml/symex" xmlns:wpg="http://schemas.microsoft.com/office/word/2010/wordprocessingGroup" xmlns:wpi="http://schemas.microsoft.com/office/word/2010/wordprocessingInk" xmlns:wne="http://schemas.microsoft.com/office/word/2006/wordml" xmlns:wps="http://schemas.microsoft.com/office/word/2010/wordprocessingShape" mc:Ignorable="w14 w15 w16se w16cid w16 w16cex w16sdtdh w16sdtfl w16du wp14">
   <w:p>
     <w:pPr>
       <w:jc w:val="center"/>
@@ -4005,7 +4530,7 @@
 </file>
 
 <file path=word/footnotes.xml><?xml version="1.0" encoding="utf-8"?>
-<w:footnotes xmlns:wpc="http://schemas.microsoft.com/office/word/2010/wordprocessingCanvas" xmlns:cx="http://schemas.microsoft.com/office/drawing/2014/chartex" xmlns:cx1="http://schemas.microsoft.com/office/drawing/2015/9/8/chartex" xmlns:cx2="http://schemas.microsoft.com/office/drawing/2015/10/21/chartex" xmlns:cx3="http://schemas.microsoft.com/office/drawing/2016/5/9/chartex" xmlns:cx4="http://schemas.microsoft.com/office/drawing/2016/5/10/chartex" xmlns:cx5="http://schemas.microsoft.com/office/drawing/2016/5/11/chartex" xmlns:cx6="http://schemas.microsoft.com/office/drawing/2016/5/12/chartex" xmlns:cx7="http://schemas.microsoft.com/office/drawing/2016/5/13/chartex" xmlns:cx8="http://schemas.microsoft.com/office/drawing/2016/5/14/chartex" xmlns:mc="http://schemas.openxmlformats.org/markup-compatibility/2006" xmlns:aink="http://schemas.microsoft.com/office/drawing/2016/ink" xmlns:am3d="http://schemas.microsoft.com/office/drawing/2017/model3d" xmlns:o="urn:schemas-microsoft-com:office:office" xmlns:r="http://schemas.openxmlformats.org/officeDocument/2006/relationships" xmlns:m="http://schemas.openxmlformats.org/officeDocument/2006/math" xmlns:v="urn:schemas-microsoft-com:vml" xmlns:wp14="http://schemas.microsoft.com/office/word/2010/wordprocessingDrawing" xmlns:wp="http://schemas.openxmlformats.org/drawingml/2006/wordprocessingDrawing" xmlns:w10="urn:schemas-microsoft-com:office:word" xmlns:w="http://schemas.openxmlformats.org/wordprocessingml/2006/main" xmlns:w14="http://schemas.microsoft.com/office/word/2010/wordml" xmlns:w15="http://schemas.microsoft.com/office/word/2012/wordml" xmlns:w16cid="http://schemas.microsoft.com/office/word/2016/wordml/cid" xmlns:w16se="http://schemas.microsoft.com/office/word/2015/wordml/symex" xmlns:wpg="http://schemas.microsoft.com/office/word/2010/wordprocessingGroup" xmlns:wpi="http://schemas.microsoft.com/office/word/2010/wordprocessingInk" xmlns:wne="http://schemas.microsoft.com/office/word/2006/wordml" xmlns:wps="http://schemas.microsoft.com/office/word/2010/wordprocessingShape" mc:Ignorable="w14 w15 w16se w16cid wp14">
+<w:footnotes xmlns:wpc="http://schemas.microsoft.com/office/word/2010/wordprocessingCanvas" xmlns:cx="http://schemas.microsoft.com/office/drawing/2014/chartex" xmlns:cx1="http://schemas.microsoft.com/office/drawing/2015/9/8/chartex" xmlns:cx2="http://schemas.microsoft.com/office/drawing/2015/10/21/chartex" xmlns:cx3="http://schemas.microsoft.com/office/drawing/2016/5/9/chartex" xmlns:cx4="http://schemas.microsoft.com/office/drawing/2016/5/10/chartex" xmlns:cx5="http://schemas.microsoft.com/office/drawing/2016/5/11/chartex" xmlns:cx6="http://schemas.microsoft.com/office/drawing/2016/5/12/chartex" xmlns:cx7="http://schemas.microsoft.com/office/drawing/2016/5/13/chartex" xmlns:cx8="http://schemas.microsoft.com/office/drawing/2016/5/14/chartex" xmlns:mc="http://schemas.openxmlformats.org/markup-compatibility/2006" xmlns:aink="http://schemas.microsoft.com/office/drawing/2016/ink" xmlns:am3d="http://schemas.microsoft.com/office/drawing/2017/model3d" xmlns:o="urn:schemas-microsoft-com:office:office" xmlns:oel="http://schemas.microsoft.com/office/2019/extlst" xmlns:r="http://schemas.openxmlformats.org/officeDocument/2006/relationships" xmlns:m="http://schemas.openxmlformats.org/officeDocument/2006/math" xmlns:v="urn:schemas-microsoft-com:vml" xmlns:wp14="http://schemas.microsoft.com/office/word/2010/wordprocessingDrawing" xmlns:wp="http://schemas.openxmlformats.org/drawingml/2006/wordprocessingDrawing" xmlns:w10="urn:schemas-microsoft-com:office:word" xmlns:w="http://schemas.openxmlformats.org/wordprocessingml/2006/main" xmlns:w14="http://schemas.microsoft.com/office/word/2010/wordml" xmlns:w15="http://schemas.microsoft.com/office/word/2012/wordml" xmlns:w16cex="http://schemas.microsoft.com/office/word/2018/wordml/cex" xmlns:w16cid="http://schemas.microsoft.com/office/word/2016/wordml/cid" xmlns:w16="http://schemas.microsoft.com/office/word/2018/wordml" xmlns:w16du="http://schemas.microsoft.com/office/word/2023/wordml/word16du" xmlns:w16sdtdh="http://schemas.microsoft.com/office/word/2020/wordml/sdtdatahash" xmlns:w16sdtfl="http://schemas.microsoft.com/office/word/2024/wordml/sdtformatlock" xmlns:w16se="http://schemas.microsoft.com/office/word/2015/wordml/symex" xmlns:wpg="http://schemas.microsoft.com/office/word/2010/wordprocessingGroup" xmlns:wpi="http://schemas.microsoft.com/office/word/2010/wordprocessingInk" xmlns:wne="http://schemas.microsoft.com/office/word/2006/wordml" xmlns:wps="http://schemas.microsoft.com/office/word/2010/wordprocessingShape" mc:Ignorable="w14 w15 w16se w16cid w16 w16cex w16sdtdh w16sdtfl w16du wp14">
   <w:footnote w:type="separator" w:id="-1">
     <w:p>
       <w:r>
@@ -4024,7 +4549,7 @@
 </file>
 
 <file path=word/numbering.xml><?xml version="1.0" encoding="utf-8"?>
-<w:numbering xmlns:wpc="http://schemas.microsoft.com/office/word/2010/wordprocessingCanvas" xmlns:cx="http://schemas.microsoft.com/office/drawing/2014/chartex" xmlns:cx1="http://schemas.microsoft.com/office/drawing/2015/9/8/chartex" xmlns:cx2="http://schemas.microsoft.com/office/drawing/2015/10/21/chartex" xmlns:cx3="http://schemas.microsoft.com/office/drawing/2016/5/9/chartex" xmlns:cx4="http://schemas.microsoft.com/office/drawing/2016/5/10/chartex" xmlns:cx5="http://schemas.microsoft.com/office/drawing/2016/5/11/chartex" xmlns:cx6="http://schemas.microsoft.com/office/drawing/2016/5/12/chartex" xmlns:cx7="http://schemas.microsoft.com/office/drawing/2016/5/13/chartex" xmlns:cx8="http://schemas.microsoft.com/office/drawing/2016/5/14/chartex" xmlns:mc="http://schemas.openxmlformats.org/markup-compatibility/2006" xmlns:aink="http://schemas.microsoft.com/office/drawing/2016/ink" xmlns:am3d="http://schemas.microsoft.com/office/drawing/2017/model3d" xmlns:o="urn:schemas-microsoft-com:office:office" xmlns:r="http://schemas.openxmlformats.org/officeDocument/2006/relationships" xmlns:m="http://schemas.openxmlformats.org/officeDocument/2006/math" xmlns:v="urn:schemas-microsoft-com:vml" xmlns:wp14="http://schemas.microsoft.com/office/word/2010/wordprocessingDrawing" xmlns:wp="http://schemas.openxmlformats.org/drawingml/2006/wordprocessingDrawing" xmlns:w10="urn:schemas-microsoft-com:office:word" xmlns:w="http://schemas.openxmlformats.org/wordprocessingml/2006/main" xmlns:w14="http://schemas.microsoft.com/office/word/2010/wordml" xmlns:w15="http://schemas.microsoft.com/office/word/2012/wordml" xmlns:w16cid="http://schemas.microsoft.com/office/word/2016/wordml/cid" xmlns:w16se="http://schemas.microsoft.com/office/word/2015/wordml/symex" xmlns:wpg="http://schemas.microsoft.com/office/word/2010/wordprocessingGroup" xmlns:wpi="http://schemas.microsoft.com/office/word/2010/wordprocessingInk" xmlns:wne="http://schemas.microsoft.com/office/word/2006/wordml" xmlns:wps="http://schemas.microsoft.com/office/word/2010/wordprocessingShape" mc:Ignorable="w14 w15 w16se w16cid wp14">
+<w:numbering xmlns:wpc="http://schemas.microsoft.com/office/word/2010/wordprocessingCanvas" xmlns:cx="http://schemas.microsoft.com/office/drawing/2014/chartex" xmlns:cx1="http://schemas.microsoft.com/office/drawing/2015/9/8/chartex" xmlns:cx2="http://schemas.microsoft.com/office/drawing/2015/10/21/chartex" xmlns:cx3="http://schemas.microsoft.com/office/drawing/2016/5/9/chartex" xmlns:cx4="http://schemas.microsoft.com/office/drawing/2016/5/10/chartex" xmlns:cx5="http://schemas.microsoft.com/office/drawing/2016/5/11/chartex" xmlns:cx6="http://schemas.microsoft.com/office/drawing/2016/5/12/chartex" xmlns:cx7="http://schemas.microsoft.com/office/drawing/2016/5/13/chartex" xmlns:cx8="http://schemas.microsoft.com/office/drawing/2016/5/14/chartex" xmlns:mc="http://schemas.openxmlformats.org/markup-compatibility/2006" xmlns:aink="http://schemas.microsoft.com/office/drawing/2016/ink" xmlns:am3d="http://schemas.microsoft.com/office/drawing/2017/model3d" xmlns:o="urn:schemas-microsoft-com:office:office" xmlns:oel="http://schemas.microsoft.com/office/2019/extlst" xmlns:r="http://schemas.openxmlformats.org/officeDocument/2006/relationships" xmlns:m="http://schemas.openxmlformats.org/officeDocument/2006/math" xmlns:v="urn:schemas-microsoft-com:vml" xmlns:wp14="http://schemas.microsoft.com/office/word/2010/wordprocessingDrawing" xmlns:wp="http://schemas.openxmlformats.org/drawingml/2006/wordprocessingDrawing" xmlns:w10="urn:schemas-microsoft-com:office:word" xmlns:w="http://schemas.openxmlformats.org/wordprocessingml/2006/main" xmlns:w14="http://schemas.microsoft.com/office/word/2010/wordml" xmlns:w15="http://schemas.microsoft.com/office/word/2012/wordml" xmlns:w16cex="http://schemas.microsoft.com/office/word/2018/wordml/cex" xmlns:w16cid="http://schemas.microsoft.com/office/word/2016/wordml/cid" xmlns:w16="http://schemas.microsoft.com/office/word/2018/wordml" xmlns:w16du="http://schemas.microsoft.com/office/word/2023/wordml/word16du" xmlns:w16sdtdh="http://schemas.microsoft.com/office/word/2020/wordml/sdtdatahash" xmlns:w16sdtfl="http://schemas.microsoft.com/office/word/2024/wordml/sdtformatlock" xmlns:w16se="http://schemas.microsoft.com/office/word/2015/wordml/symex" xmlns:wpg="http://schemas.microsoft.com/office/word/2010/wordprocessingGroup" xmlns:wpi="http://schemas.microsoft.com/office/word/2010/wordprocessingInk" xmlns:wne="http://schemas.microsoft.com/office/word/2006/wordml" xmlns:wps="http://schemas.microsoft.com/office/word/2010/wordprocessingShape" mc:Ignorable="w14 w15 w16se w16cid w16 w16cex w16sdtdh w16sdtfl w16du wp14">
   <w:abstractNum w:abstractNumId="0" w15:restartNumberingAfterBreak="0">
     <w:nsid w:val="10791DFB"/>
     <w:multiLevelType w:val="hybridMultilevel"/>
@@ -4165,13 +4690,13 @@
       </w:pPr>
     </w:lvl>
   </w:abstractNum>
-  <w:num w:numId="1">
+  <w:num w:numId="1" w16cid:durableId="1713918396">
     <w:abstractNumId w:val="1"/>
     <w:lvlOverride w:ilvl="0">
       <w:startOverride w:val="1"/>
     </w:lvlOverride>
   </w:num>
-  <w:num w:numId="2">
+  <w:num w:numId="2" w16cid:durableId="5207690">
     <w:abstractNumId w:val="0"/>
     <w:lvlOverride w:ilvl="0">
       <w:startOverride w:val="1"/>
@@ -4181,7 +4706,7 @@
 </file>
 
 <file path=word/styles.xml><?xml version="1.0" encoding="utf-8"?>
-<w:styles xmlns:mc="http://schemas.openxmlformats.org/markup-compatibility/2006" xmlns:r="http://schemas.openxmlformats.org/officeDocument/2006/relationships" xmlns:w="http://schemas.openxmlformats.org/wordprocessingml/2006/main" xmlns:w14="http://schemas.microsoft.com/office/word/2010/wordml" xmlns:w15="http://schemas.microsoft.com/office/word/2012/wordml" xmlns:w16cid="http://schemas.microsoft.com/office/word/2016/wordml/cid" xmlns:w16se="http://schemas.microsoft.com/office/word/2015/wordml/symex" mc:Ignorable="w14 w15 w16se w16cid">
+<w:styles xmlns:mc="http://schemas.openxmlformats.org/markup-compatibility/2006" xmlns:r="http://schemas.openxmlformats.org/officeDocument/2006/relationships" xmlns:w="http://schemas.openxmlformats.org/wordprocessingml/2006/main" xmlns:w14="http://schemas.microsoft.com/office/word/2010/wordml" xmlns:w15="http://schemas.microsoft.com/office/word/2012/wordml" xmlns:w16cex="http://schemas.microsoft.com/office/word/2018/wordml/cex" xmlns:w16cid="http://schemas.microsoft.com/office/word/2016/wordml/cid" xmlns:w16="http://schemas.microsoft.com/office/word/2018/wordml" xmlns:w16du="http://schemas.microsoft.com/office/word/2023/wordml/word16du" xmlns:w16sdtdh="http://schemas.microsoft.com/office/word/2020/wordml/sdtdatahash" xmlns:w16sdtfl="http://schemas.microsoft.com/office/word/2024/wordml/sdtformatlock" xmlns:w16se="http://schemas.microsoft.com/office/word/2015/wordml/symex" mc:Ignorable="w14 w15 w16se w16cid w16 w16cex w16sdtdh w16sdtfl w16du">
   <w:docDefaults>
     <w:rPrDefault>
       <w:rPr>
@@ -4193,7 +4718,7 @@
     </w:rPrDefault>
     <w:pPrDefault/>
   </w:docDefaults>
-  <w:latentStyles w:defLockedState="0" w:defUIPriority="99" w:defSemiHidden="0" w:defUnhideWhenUsed="0" w:defQFormat="0" w:count="375">
+  <w:latentStyles w:defLockedState="0" w:defUIPriority="99" w:defSemiHidden="0" w:defUnhideWhenUsed="0" w:defQFormat="0" w:count="376">
     <w:lsdException w:name="Normal" w:uiPriority="0" w:qFormat="1"/>
     <w:lsdException w:name="heading 1" w:uiPriority="9" w:qFormat="1"/>
     <w:lsdException w:name="heading 2" w:semiHidden="1" w:uiPriority="9" w:unhideWhenUsed="1" w:qFormat="1"/>
@@ -4569,6 +5094,7 @@
     <w:lsdException w:name="Smart Hyperlink" w:semiHidden="1" w:unhideWhenUsed="1"/>
     <w:lsdException w:name="Hashtag" w:semiHidden="1" w:unhideWhenUsed="1"/>
     <w:lsdException w:name="Unresolved Mention" w:semiHidden="1" w:unhideWhenUsed="1"/>
+    <w:lsdException w:name="Smart Link" w:semiHidden="1" w:unhideWhenUsed="1"/>
   </w:latentStyles>
   <w:style w:type="paragraph" w:default="1" w:styleId="Normal">
     <w:name w:val="Normal"/>
@@ -4576,6 +5102,7 @@
   </w:style>
   <w:style w:type="paragraph" w:styleId="Ttulo1">
     <w:name w:val="heading 1"/>
+    <w:link w:val="Ttulo1Char"/>
     <w:uiPriority w:val="9"/>
     <w:qFormat/>
     <w:pPr>
@@ -4592,6 +5119,7 @@
   </w:style>
   <w:style w:type="paragraph" w:styleId="Ttulo2">
     <w:name w:val="heading 2"/>
+    <w:link w:val="Ttulo2Char"/>
     <w:uiPriority w:val="9"/>
     <w:unhideWhenUsed/>
     <w:qFormat/>
@@ -4823,6 +5351,34 @@
     <w:link w:val="Rodap"/>
     <w:uiPriority w:val="99"/>
     <w:rsid w:val="005475E5"/>
+  </w:style>
+  <w:style w:type="character" w:customStyle="1" w:styleId="Ttulo2Char">
+    <w:name w:val="Título 2 Char"/>
+    <w:basedOn w:val="Fontepargpadro"/>
+    <w:link w:val="Ttulo2"/>
+    <w:uiPriority w:val="9"/>
+    <w:rsid w:val="006D069A"/>
+    <w:rPr>
+      <w:b/>
+      <w:bCs/>
+      <w:color w:val="2E4D8A"/>
+      <w:sz w:val="24"/>
+      <w:szCs w:val="24"/>
+    </w:rPr>
+  </w:style>
+  <w:style w:type="character" w:customStyle="1" w:styleId="Ttulo1Char">
+    <w:name w:val="Título 1 Char"/>
+    <w:basedOn w:val="Fontepargpadro"/>
+    <w:link w:val="Ttulo1"/>
+    <w:uiPriority w:val="9"/>
+    <w:rsid w:val="006D069A"/>
+    <w:rPr>
+      <w:b/>
+      <w:bCs/>
+      <w:color w:val="1F3864"/>
+      <w:sz w:val="28"/>
+      <w:szCs w:val="28"/>
+    </w:rPr>
   </w:style>
 </w:styles>
 </file>

</xml_diff>